<commit_message>
Refusi corretti in Fondamenti e Programmazione, stili titoli su tutti i Word, STATO aggiornato
</commit_message>
<xml_diff>
--- a/Fondamenti Info/Fondamenti Informatica.docx
+++ b/Fondamenti Info/Fondamenti Informatica.docx
@@ -4,6 +4,7 @@
   <w:body>
     <w:p>
       <w:pPr>
+        <w:pStyle w:val="Titolo1"/>
         <w:rPr>
           <w:b/>
           <w:bCs/>
@@ -64,6 +65,7 @@
     </w:p>
     <w:p>
       <w:pPr>
+        <w:pStyle w:val="Titolo2"/>
         <w:rPr>
           <w:b/>
           <w:bCs/>
@@ -153,6 +155,7 @@
     </w:p>
     <w:p>
       <w:pPr>
+        <w:pStyle w:val="Titolo2"/>
         <w:rPr>
           <w:b/>
           <w:bCs/>
@@ -300,6 +303,7 @@
     </w:p>
     <w:p>
       <w:pPr>
+        <w:pStyle w:val="Titolo2"/>
         <w:rPr>
           <w:b/>
           <w:bCs/>
@@ -376,6 +380,7 @@
     <w:p/>
     <w:p>
       <w:pPr>
+        <w:pStyle w:val="Titolo1"/>
         <w:rPr>
           <w:b/>
           <w:bCs/>
@@ -457,6 +462,7 @@
     </w:p>
     <w:p>
       <w:pPr>
+        <w:pStyle w:val="Titolo2"/>
         <w:rPr>
           <w:b/>
           <w:bCs/>
@@ -610,6 +616,7 @@
     </w:p>
     <w:p>
       <w:pPr>
+        <w:pStyle w:val="Titolo2"/>
         <w:rPr>
           <w:b/>
           <w:bCs/>
@@ -862,6 +869,7 @@
     </w:p>
     <w:p>
       <w:pPr>
+        <w:pStyle w:val="Titolo2"/>
         <w:rPr>
           <w:b/>
           <w:bCs/>
@@ -978,6 +986,7 @@
     <w:p/>
     <w:p>
       <w:pPr>
+        <w:pStyle w:val="Titolo1"/>
         <w:rPr>
           <w:b/>
           <w:bCs/>
@@ -1026,6 +1035,7 @@
     </w:p>
     <w:p>
       <w:pPr>
+        <w:pStyle w:val="Titolo2"/>
         <w:rPr>
           <w:b/>
           <w:bCs/>
@@ -1095,6 +1105,7 @@
     </w:p>
     <w:p>
       <w:pPr>
+        <w:pStyle w:val="Titolo2"/>
         <w:rPr>
           <w:b/>
           <w:bCs/>
@@ -1320,6 +1331,7 @@
     </w:p>
     <w:p>
       <w:pPr>
+        <w:pStyle w:val="Titolo2"/>
         <w:rPr>
           <w:b/>
           <w:bCs/>
@@ -1518,6 +1530,7 @@
     </w:p>
     <w:p>
       <w:pPr>
+        <w:pStyle w:val="Titolo2"/>
         <w:rPr>
           <w:b/>
           <w:bCs/>
@@ -1669,6 +1682,7 @@
     <w:p/>
     <w:p>
       <w:pPr>
+        <w:pStyle w:val="Titolo1"/>
         <w:rPr>
           <w:b/>
           <w:bCs/>
@@ -1714,6 +1728,7 @@
     </w:p>
     <w:p>
       <w:pPr>
+        <w:pStyle w:val="Titolo2"/>
         <w:rPr>
           <w:b/>
           <w:bCs/>
@@ -1762,7 +1777,7 @@
         <w:t>Codice ASCII</w:t>
       </w:r>
       <w:r>
-        <w:t xml:space="preserve">: Nascosto negli anni '40 e '50 per standardizzare la comunicazione tra macchine diverse, il codice </w:t>
+        <w:t xml:space="preserve">: Nato negli anni '40 e '50 per standardizzare la comunicazione tra macchine diverse, il codice </w:t>
       </w:r>
       <w:r>
         <w:rPr>
@@ -1913,6 +1928,7 @@
     </w:p>
     <w:p>
       <w:pPr>
+        <w:pStyle w:val="Titolo2"/>
         <w:rPr>
           <w:b/>
           <w:bCs/>
@@ -2129,6 +2145,7 @@
     <w:p/>
     <w:p>
       <w:pPr>
+        <w:pStyle w:val="Titolo1"/>
         <w:rPr>
           <w:b/>
           <w:bCs/>
@@ -2141,11 +2158,12 @@
           <w:bCs/>
           <w:color w:val="EE0000"/>
         </w:rPr>
-        <w:t>5.Architettura e Memorizzazione dei Bit</w:t>
-      </w:r>
-    </w:p>
-    <w:p>
-      <w:pPr>
+        <w:t>5. Architettura e Memorizzazione dei Bit</w:t>
+      </w:r>
+    </w:p>
+    <w:p>
+      <w:pPr>
+        <w:pStyle w:val="Titolo2"/>
         <w:rPr>
           <w:b/>
           <w:bCs/>
@@ -2188,6 +2206,7 @@
     </w:p>
     <w:p>
       <w:pPr>
+        <w:pStyle w:val="Titolo2"/>
         <w:rPr>
           <w:b/>
           <w:bCs/>
@@ -2333,6 +2352,7 @@
     </w:p>
     <w:p>
       <w:pPr>
+        <w:pStyle w:val="Titolo2"/>
         <w:rPr>
           <w:b/>
           <w:bCs/>
@@ -2441,6 +2461,7 @@
     </w:p>
     <w:p>
       <w:pPr>
+        <w:pStyle w:val="Titolo2"/>
         <w:rPr>
           <w:b/>
           <w:bCs/>
@@ -2458,6 +2479,7 @@
     </w:p>
     <w:p>
       <w:pPr>
+        <w:pStyle w:val="Titolo2"/>
         <w:rPr>
           <w:b/>
           <w:bCs/>
@@ -2586,6 +2608,7 @@
     </w:p>
     <w:p>
       <w:pPr>
+        <w:pStyle w:val="Titolo2"/>
         <w:rPr>
           <w:b/>
           <w:bCs/>
@@ -2763,6 +2786,7 @@
     </w:p>
     <w:p>
       <w:pPr>
+        <w:pStyle w:val="Titolo2"/>
         <w:rPr>
           <w:b/>
           <w:bCs/>
@@ -2804,6 +2828,7 @@
     </w:p>
     <w:p>
       <w:pPr>
+        <w:pStyle w:val="Titolo2"/>
         <w:rPr>
           <w:b/>
           <w:bCs/>
@@ -2836,6 +2861,7 @@
     </w:p>
     <w:p>
       <w:pPr>
+        <w:pStyle w:val="Titolo2"/>
         <w:rPr>
           <w:b/>
           <w:bCs/>
@@ -3102,6 +3128,7 @@
     </w:p>
     <w:p>
       <w:pPr>
+        <w:pStyle w:val="Titolo2"/>
         <w:rPr>
           <w:b/>
           <w:bCs/>
@@ -3201,6 +3228,7 @@
     </w:p>
     <w:p>
       <w:pPr>
+        <w:pStyle w:val="Titolo2"/>
         <w:rPr>
           <w:b/>
           <w:bCs/>
@@ -3220,7 +3248,7 @@
     </w:p>
     <w:p>
       <w:r>
-        <w:t>Le memorie Flash eliminano qualsiasi componente meccanico in movement, memorizzando i dati inviando segnali elettrici che catturano gli elettroni all'interno di microscopiche camere di diossido di silicio.</w:t>
+        <w:t>Le memorie Flash eliminano qualsiasi componente meccanico in movimento, memorizzando i dati inviando segnali elettrici che catturano gli elettroni all'interno di microscopiche camere di diossido di silicio.</w:t>
       </w:r>
     </w:p>
     <w:p>
@@ -3340,6 +3368,7 @@
     <w:p/>
     <w:p>
       <w:pPr>
+        <w:pStyle w:val="Titolo1"/>
         <w:rPr>
           <w:b/>
           <w:bCs/>
@@ -3357,6 +3386,7 @@
     </w:p>
     <w:p>
       <w:pPr>
+        <w:pStyle w:val="Titolo2"/>
         <w:rPr>
           <w:b/>
           <w:bCs/>
@@ -3532,6 +3562,7 @@
     </w:p>
     <w:p>
       <w:pPr>
+        <w:pStyle w:val="Titolo2"/>
         <w:rPr>
           <w:b/>
           <w:bCs/>
@@ -3590,6 +3621,7 @@
     </w:p>
     <w:p>
       <w:pPr>
+        <w:pStyle w:val="Titolo2"/>
         <w:rPr>
           <w:b/>
           <w:bCs/>
@@ -3646,6 +3678,7 @@
     </w:p>
     <w:p>
       <w:pPr>
+        <w:pStyle w:val="Titolo2"/>
         <w:rPr>
           <w:b/>
           <w:bCs/>
@@ -3668,6 +3701,7 @@
     </w:p>
     <w:p>
       <w:pPr>
+        <w:pStyle w:val="Titolo2"/>
         <w:rPr>
           <w:b/>
           <w:bCs/>
@@ -3867,6 +3901,7 @@
     </w:p>
     <w:p>
       <w:pPr>
+        <w:pStyle w:val="Titolo2"/>
         <w:rPr>
           <w:b/>
           <w:bCs/>
@@ -3979,6 +4014,7 @@
     </w:p>
     <w:p>
       <w:pPr>
+        <w:pStyle w:val="Titolo2"/>
         <w:rPr>
           <w:b/>
           <w:bCs/>
@@ -4089,6 +4125,7 @@
     </w:p>
     <w:p>
       <w:pPr>
+        <w:pStyle w:val="Titolo2"/>
         <w:rPr>
           <w:b/>
           <w:bCs/>
@@ -4203,6 +4240,7 @@
     </w:p>
     <w:p>
       <w:pPr>
+        <w:pStyle w:val="Titolo1"/>
         <w:rPr>
           <w:b/>
           <w:bCs/>
@@ -4215,12 +4253,12 @@
           <w:bCs/>
           <w:color w:val="EE0000"/>
         </w:rPr>
-        <w:lastRenderedPageBreak/>
-        <w:t>6. Il Sistema Numerico Binario e Aritmetica</w:t>
-      </w:r>
-    </w:p>
-    <w:p>
-      <w:pPr>
+        <w:t>7. Il Sistema Numerico Binario e Aritmetica</w:t>
+      </w:r>
+    </w:p>
+    <w:p>
+      <w:pPr>
+        <w:pStyle w:val="Titolo2"/>
         <w:rPr>
           <w:b/>
           <w:bCs/>
@@ -4370,6 +4408,7 @@
     </w:p>
     <w:p>
       <w:pPr>
+        <w:pStyle w:val="Titolo2"/>
         <w:rPr>
           <w:b/>
           <w:bCs/>
@@ -4387,6 +4426,7 @@
     </w:p>
     <w:p>
       <w:pPr>
+        <w:pStyle w:val="Titolo2"/>
         <w:rPr>
           <w:b/>
           <w:bCs/>
@@ -4585,6 +4625,7 @@
     </w:p>
     <w:p>
       <w:pPr>
+        <w:pStyle w:val="Titolo2"/>
         <w:rPr>
           <w:b/>
           <w:bCs/>
@@ -4796,6 +4837,7 @@
     </w:p>
     <w:p>
       <w:pPr>
+        <w:pStyle w:val="Titolo2"/>
         <w:rPr>
           <w:b/>
           <w:bCs/>
@@ -4813,6 +4855,7 @@
     </w:p>
     <w:p>
       <w:pPr>
+        <w:pStyle w:val="Titolo2"/>
         <w:rPr>
           <w:b/>
           <w:bCs/>
@@ -5008,6 +5051,7 @@
     </w:p>
     <w:p>
       <w:pPr>
+        <w:pStyle w:val="Titolo2"/>
         <w:rPr>
           <w:b/>
           <w:bCs/>
@@ -5259,6 +5303,7 @@
     <w:p/>
     <w:p>
       <w:pPr>
+        <w:pStyle w:val="Titolo1"/>
         <w:rPr>
           <w:b/>
           <w:bCs/>
@@ -5271,11 +5316,12 @@
           <w:bCs/>
           <w:color w:val="EE0000"/>
         </w:rPr>
-        <w:t>7. Rappresentazione degli interi (complemento a due e eccesso)</w:t>
-      </w:r>
-    </w:p>
-    <w:p>
-      <w:pPr>
+        <w:t>8. Rappresentazione degli interi (complemento a due e eccesso)</w:t>
+      </w:r>
+    </w:p>
+    <w:p>
+      <w:pPr>
+        <w:pStyle w:val="Titolo2"/>
         <w:rPr>
           <w:b/>
           <w:bCs/>
@@ -5600,6 +5646,7 @@
     </w:p>
     <w:p>
       <w:pPr>
+        <w:pStyle w:val="Titolo2"/>
         <w:rPr>
           <w:b/>
           <w:bCs/>
@@ -5774,13 +5821,11 @@
       <w:r>
         <w:t xml:space="preserve"> mediante il circuito di inversione (complemento) e poi inoltra i dati all'</w:t>
       </w:r>
-    </w:p>
-    <w:p>
-      <w:r>
-        <w:rPr>
-          <w:highlight w:val="yellow"/>
-        </w:rPr>
-        <w:t>addizionale standard</w:t>
+      <w:r>
+        <w:rPr>
+          <w:highlight w:val="yellow"/>
+        </w:rPr>
+        <w:t>addizionatore standard</w:t>
       </w:r>
       <w:r>
         <w:t>.</w:t>
@@ -5793,6 +5838,7 @@
     </w:p>
     <w:p>
       <w:pPr>
+        <w:pStyle w:val="Titolo2"/>
         <w:rPr>
           <w:b/>
           <w:bCs/>
@@ -5819,7 +5865,7 @@
         <w:t>l'intervallo di valori rappresentabili è limitato</w:t>
       </w:r>
       <w:r>
-        <w:t xml:space="preserve">. Il fenomeno dell me </w:t>
+        <w:t>. Il fenomeno dell'</w:t>
       </w:r>
       <w:r>
         <w:rPr>
@@ -6149,6 +6195,7 @@
     <w:p/>
     <w:p>
       <w:pPr>
+        <w:pStyle w:val="Titolo1"/>
         <w:rPr>
           <w:b/>
           <w:bCs/>
@@ -6161,7 +6208,7 @@
           <w:bCs/>
           <w:color w:val="EE0000"/>
         </w:rPr>
-        <w:t xml:space="preserve">8. </w:t>
+        <w:t xml:space="preserve">9. </w:t>
       </w:r>
       <w:r>
         <w:rPr>
@@ -6182,6 +6229,7 @@
     </w:p>
     <w:p>
       <w:pPr>
+        <w:pStyle w:val="Titolo2"/>
         <w:rPr>
           <w:b/>
           <w:bCs/>
@@ -6503,6 +6551,7 @@
     </w:p>
     <w:p>
       <w:pPr>
+        <w:pStyle w:val="Titolo2"/>
         <w:rPr>
           <w:color w:val="E97132" w:themeColor="accent2"/>
         </w:rPr>
@@ -6650,6 +6699,7 @@
     </w:p>
     <w:p>
       <w:pPr>
+        <w:pStyle w:val="Titolo2"/>
         <w:rPr>
           <w:b/>
           <w:bCs/>
@@ -6749,6 +6799,7 @@
     <w:p/>
     <w:p>
       <w:pPr>
+        <w:pStyle w:val="Titolo1"/>
         <w:rPr>
           <w:b/>
           <w:bCs/>
@@ -6761,11 +6812,12 @@
           <w:bCs/>
           <w:color w:val="EE0000"/>
         </w:rPr>
-        <w:t>9. Compressione Dei Dati</w:t>
-      </w:r>
-    </w:p>
-    <w:p>
-      <w:pPr>
+        <w:t>10. Compressione Dei Dati</w:t>
+      </w:r>
+    </w:p>
+    <w:p>
+      <w:pPr>
+        <w:pStyle w:val="Titolo2"/>
         <w:rPr>
           <w:b/>
           <w:bCs/>
@@ -7046,6 +7098,7 @@
     </w:p>
     <w:p>
       <w:pPr>
+        <w:pStyle w:val="Titolo2"/>
         <w:rPr>
           <w:b/>
           <w:bCs/>
@@ -7401,6 +7454,7 @@
     </w:p>
     <w:p>
       <w:pPr>
+        <w:pStyle w:val="Titolo2"/>
         <w:rPr>
           <w:b/>
           <w:bCs/>
@@ -7650,6 +7704,7 @@
     </w:p>
     <w:p>
       <w:pPr>
+        <w:pStyle w:val="Titolo2"/>
         <w:rPr>
           <w:b/>
           <w:bCs/>
@@ -7788,6 +7843,7 @@
     <w:p/>
     <w:p>
       <w:pPr>
+        <w:pStyle w:val="Titolo1"/>
         <w:rPr>
           <w:b/>
           <w:bCs/>
@@ -7800,8 +7856,7 @@
           <w:bCs/>
           <w:color w:val="EE0000"/>
         </w:rPr>
-        <w:lastRenderedPageBreak/>
-        <w:t xml:space="preserve">10. </w:t>
+        <w:t xml:space="preserve">11. </w:t>
       </w:r>
       <w:r>
         <w:rPr>
@@ -7822,6 +7877,7 @@
     </w:p>
     <w:p>
       <w:pPr>
+        <w:pStyle w:val="Titolo2"/>
         <w:rPr>
           <w:b/>
           <w:bCs/>
@@ -7985,6 +8041,7 @@
     </w:p>
     <w:p>
       <w:pPr>
+        <w:pStyle w:val="Titolo2"/>
         <w:rPr>
           <w:b/>
           <w:bCs/>
@@ -14909,16 +14966,8 @@
     <w:rsid w:val="008742F7"/>
     <w:pPr>
       <w:keepNext/>
-      <w:keepLines/>
-      <w:spacing w:before="360" w:after="80"/>
       <w:outlineLvl w:val="0"/>
     </w:pPr>
-    <w:rPr>
-      <w:rFonts w:asciiTheme="majorHAnsi" w:eastAsiaTheme="majorEastAsia" w:hAnsiTheme="majorHAnsi" w:cstheme="majorBidi"/>
-      <w:color w:val="0F4761" w:themeColor="accent1" w:themeShade="BF"/>
-      <w:sz w:val="40"/>
-      <w:szCs w:val="40"/>
-    </w:rPr>
   </w:style>
   <w:style w:type="paragraph" w:styleId="Titolo2">
     <w:name w:val="heading 2"/>
@@ -14932,16 +14981,8 @@
     <w:rsid w:val="008742F7"/>
     <w:pPr>
       <w:keepNext/>
-      <w:keepLines/>
-      <w:spacing w:before="160" w:after="80"/>
       <w:outlineLvl w:val="1"/>
     </w:pPr>
-    <w:rPr>
-      <w:rFonts w:asciiTheme="majorHAnsi" w:eastAsiaTheme="majorEastAsia" w:hAnsiTheme="majorHAnsi" w:cstheme="majorBidi"/>
-      <w:color w:val="0F4761" w:themeColor="accent1" w:themeShade="BF"/>
-      <w:sz w:val="32"/>
-      <w:szCs w:val="32"/>
-    </w:rPr>
   </w:style>
   <w:style w:type="paragraph" w:styleId="Titolo3">
     <w:name w:val="heading 3"/>

</xml_diff>

<commit_message>
Fondamenti: unito il contenuto duplicato (memoria di massa, ASCII/Unicode, RGB)
</commit_message>
<xml_diff>
--- a/Fondamenti Info/Fondamenti Informatica.docx
+++ b/Fondamenti Info/Fondamenti Informatica.docx
@@ -1032,6 +1032,10 @@
       <w:r>
         <w:t>, consentendone il recupero anche a computer spento.</w:t>
       </w:r>
+      <w:r>
+        <w:rPr/>
+        <w:t xml:space="preserve"> Per questo si parla anche di memoria secondaria, caratterizzata da non volatilità, alta capacità e costi contenuti.</w:t>
+      </w:r>
     </w:p>
     <w:p>
       <w:pPr>
@@ -1199,6 +1203,22 @@
       <w:r>
         <w:t>.</w:t>
       </w:r>
+      <w:r>
+        <w:rPr/>
+        <w:t xml:space="preserve"> Ogni settore contiene una quantità fissa di dati (tipicamente da 512 byte a pochi KB).</w:t>
+      </w:r>
+    </w:p>
+    <w:p>
+      <w:r>
+        <w:rPr>
+          <w:b/>
+        </w:rPr>
+        <w:t>Zoned-Bit Recording</w:t>
+      </w:r>
+      <w:r>
+        <w:rPr/>
+        <w:t>: per ottimizzare lo spazio nei dischi ad alta capacità, le tracce esterne (più lunghe) contengono un numero maggiore di settori rispetto a quelle interne.</w:t>
+      </w:r>
     </w:p>
     <w:p>
       <w:r>
@@ -1228,6 +1248,18 @@
       </w:r>
       <w:r>
         <w:t xml:space="preserve"> senza che la superficie si usuri.</w:t>
+      </w:r>
+    </w:p>
+    <w:p>
+      <w:r>
+        <w:rPr>
+          <w:b/>
+        </w:rPr>
+        <w:t>Protezione dai guasti</w:t>
+      </w:r>
+      <w:r>
+        <w:rPr/>
+        <w:t>: per evitare guasti catastrofici (head crash) causati dalla polvere, i dischi rigidi sono sigillati in fabbrica.</w:t>
       </w:r>
     </w:p>
     <w:p>
@@ -1322,6 +1354,24 @@
     </w:p>
     <w:p>
       <w:pPr>
+        <w:numPr>
+          <w:ilvl w:val="0"/>
+          <w:numId w:val="7"/>
+        </w:numPr>
+      </w:pPr>
+      <w:r>
+        <w:rPr>
+          <w:b/>
+        </w:rPr>
+        <w:t>Velocità di trasferimento (Transfer Rate)</w:t>
+      </w:r>
+      <w:r>
+        <w:rPr/>
+        <w:t>: la velocità con cui i dati vengono trasferiti da o verso il disco.</w:t>
+      </w:r>
+    </w:p>
+    <w:p>
+      <w:pPr>
         <w:rPr>
           <w:b/>
           <w:bCs/>
@@ -1570,6 +1620,10 @@
       <w:r>
         <w:t>.</w:t>
       </w:r>
+      <w:r>
+        <w:rPr/>
+        <w:t xml:space="preserve"> Gli SSD (Solid-State Drive) sono destinati a rimpiazzare gli HDD nei computer.</w:t>
+      </w:r>
     </w:p>
     <w:p>
       <w:r>
@@ -1677,6 +1731,18 @@
       </w:r>
       <w:r>
         <w:t>, prolungando così la vita operativa del dispositivo.</w:t>
+      </w:r>
+    </w:p>
+    <w:p>
+      <w:r>
+        <w:rPr>
+          <w:b/>
+        </w:rPr>
+        <w:t>Schede di memoria</w:t>
+      </w:r>
+      <w:r>
+        <w:rPr/>
+        <w:t>: la tecnologia Flash è impiegata anche nelle schede SD, SDHC (fino a 32 GB) e SDXC (fino a oltre 1 TB), ampiamente usate in smartphone e fotocamere.</w:t>
       </w:r>
     </w:p>
     <w:p/>
@@ -1832,6 +1898,10 @@
       </w:r>
       <w:r>
         <w:t xml:space="preserve"> (aggiungendo uno 0 iniziale). Questo ha reso disponibili ulteriori 128 combinazioni per estensioni regionali.</w:t>
+      </w:r>
+      <w:r>
+        <w:rPr/>
+        <w:t xml:space="preserve"> Lo standard è stato sviluppato dall'ANSI (American National Standards Institute).</w:t>
       </w:r>
     </w:p>
     <w:p>
@@ -2846,17 +2916,27 @@
     </w:p>
     <w:p>
       <w:r>
-        <w:t xml:space="preserve">La memoria principale è limitata e volatile; per conservare grandi quantitativi di dati in modo permanente si utilizzano i </w:t>
-      </w:r>
-      <w:r>
-        <w:rPr>
-          <w:b/>
-          <w:bCs/>
-        </w:rPr>
-        <w:t>supporti di memoria di massa</w:t>
-      </w:r>
-      <w:r>
-        <w:t xml:space="preserve"> (o memoria secondaria), caratterizzati da non volatilità, alta capacità e costi contenuti.</w:t>
+        <w:rPr/>
+        <w:t>La memoria di massa (dischi magnetici, supporti ottici, memorie Flash e SSD, schede di memoria) è descritta nel dettaglio nel capitolo 3: qui si ricorda solo che completa la memoria principale, limitata e volatile, con capacità elevate e conservazione permanente dei dati.</w:t>
+      </w:r>
+    </w:p>
+    <w:p/>
+    <w:p>
+      <w:pPr>
+        <w:pStyle w:val="Titolo1"/>
+        <w:rPr>
+          <w:b/>
+          <w:bCs/>
+          <w:color w:val="EE0000"/>
+        </w:rPr>
+      </w:pPr>
+      <w:r>
+        <w:rPr>
+          <w:b/>
+          <w:bCs/>
+          <w:color w:val="EE0000"/>
+        </w:rPr>
+        <w:t>6. Codifica E Rappresentazione Dei Dati</w:t>
       </w:r>
     </w:p>
     <w:p>
@@ -2874,690 +2954,13 @@
           <w:bCs/>
           <w:color w:val="E97132" w:themeColor="accent2"/>
         </w:rPr>
-        <w:t>Dischi Magnetici (Hard Disk Drive - HDD)</w:t>
-      </w:r>
-    </w:p>
-    <w:p>
-      <w:r>
-        <w:t>La tecnologia magnetica sfrutta piatti rigidi in rapida rotazione ricoperti da un materiale magnetizzabile.</w:t>
-      </w:r>
-    </w:p>
-    <w:p>
-      <w:pPr>
-        <w:numPr>
-          <w:ilvl w:val="0"/>
-          <w:numId w:val="16"/>
-        </w:numPr>
-      </w:pPr>
-      <w:r>
-        <w:rPr>
-          <w:b/>
-          <w:bCs/>
-        </w:rPr>
-        <w:t>Geometria del disco</w:t>
-      </w:r>
-      <w:r>
-        <w:t xml:space="preserve">: le testine di lettura/scrittura esplorano la superficie tracciando cerchi concentrici detti </w:t>
-      </w:r>
-      <w:r>
-        <w:rPr>
-          <w:b/>
-          <w:bCs/>
-        </w:rPr>
-        <w:t>tracce</w:t>
-      </w:r>
-      <w:r>
-        <w:t xml:space="preserve"> (</w:t>
-      </w:r>
-      <w:r>
-        <w:rPr>
-          <w:i/>
-          <w:iCs/>
-        </w:rPr>
-        <w:t>tracks</w:t>
-      </w:r>
-      <w:r>
-        <w:t xml:space="preserve">). Ogni traccia è suddivisa in archi denominati </w:t>
-      </w:r>
-      <w:r>
-        <w:rPr>
-          <w:b/>
-          <w:bCs/>
-        </w:rPr>
-        <w:t>settori</w:t>
-      </w:r>
-      <w:r>
-        <w:t xml:space="preserve"> (</w:t>
-      </w:r>
-      <w:r>
-        <w:rPr>
-          <w:i/>
-          <w:iCs/>
-        </w:rPr>
-        <w:t>sectors</w:t>
-      </w:r>
-      <w:r>
-        <w:t xml:space="preserve">), ciascuno dei quali contiene una quantità fissa di dati (tipicamente da 512 byte a pochi KB). L'insieme delle tracce poste alla medesima distanza dal centro su più piatti sovrapposti forma un </w:t>
-      </w:r>
-      <w:r>
-        <w:rPr>
-          <w:b/>
-          <w:bCs/>
-        </w:rPr>
-        <w:t>cilindro</w:t>
-      </w:r>
-      <w:r>
-        <w:t xml:space="preserve"> (</w:t>
-      </w:r>
-      <w:r>
-        <w:rPr>
-          <w:i/>
-          <w:iCs/>
-        </w:rPr>
-        <w:t>cylinder</w:t>
-      </w:r>
-      <w:r>
-        <w:t>).</w:t>
-      </w:r>
-    </w:p>
-    <w:p>
-      <w:pPr>
-        <w:numPr>
-          <w:ilvl w:val="0"/>
-          <w:numId w:val="16"/>
-        </w:numPr>
-      </w:pPr>
-      <w:r>
-        <w:rPr>
-          <w:b/>
-          <w:bCs/>
-        </w:rPr>
-        <w:t>Zoned-Bit Recording</w:t>
-      </w:r>
-      <w:r>
-        <w:t xml:space="preserve">: per ottimizzare lo spazio nei dischi ad alta capacità, le tracce esterne (più lunghe) contengono un numero maggiore di settori rispetto a quelle interne (tecnica del </w:t>
-      </w:r>
-      <w:r>
-        <w:rPr>
-          <w:i/>
-          <w:iCs/>
-        </w:rPr>
-        <w:t>zoned-bit recording</w:t>
-      </w:r>
-      <w:r>
-        <w:t>).</w:t>
-      </w:r>
-    </w:p>
-    <w:p>
-      <w:pPr>
-        <w:numPr>
-          <w:ilvl w:val="0"/>
-          <w:numId w:val="16"/>
-        </w:numPr>
-      </w:pPr>
-      <w:r>
-        <w:rPr>
-          <w:b/>
-          <w:bCs/>
-        </w:rPr>
-        <w:t>Prestazioni</w:t>
-      </w:r>
-      <w:r>
-        <w:t xml:space="preserve">: le prestazioni di un HDD sono misurate da: </w:t>
-      </w:r>
-    </w:p>
-    <w:p>
-      <w:pPr>
-        <w:numPr>
-          <w:ilvl w:val="1"/>
-          <w:numId w:val="16"/>
-        </w:numPr>
-      </w:pPr>
-      <w:r>
-        <w:rPr>
-          <w:b/>
-          <w:bCs/>
-        </w:rPr>
-        <w:t>Seek time</w:t>
-      </w:r>
-      <w:r>
-        <w:t>: il tempo necessario per spostare il braccio della testina sulla traccia desiderata.</w:t>
-      </w:r>
-    </w:p>
-    <w:p>
-      <w:pPr>
-        <w:numPr>
-          <w:ilvl w:val="1"/>
-          <w:numId w:val="16"/>
-        </w:numPr>
-      </w:pPr>
-      <w:r>
-        <w:rPr>
-          <w:b/>
-          <w:bCs/>
-        </w:rPr>
-        <w:t>Latency (Rotational delay)</w:t>
-      </w:r>
-      <w:r>
-        <w:t>: il tempo medio impiegato dal disco per far ruotare il settore richiesto sotto la testina.</w:t>
-      </w:r>
-    </w:p>
-    <w:p>
-      <w:pPr>
-        <w:numPr>
-          <w:ilvl w:val="1"/>
-          <w:numId w:val="16"/>
-        </w:numPr>
-      </w:pPr>
-      <w:r>
-        <w:rPr>
-          <w:b/>
-          <w:bCs/>
-        </w:rPr>
-        <w:t>Access time</w:t>
-      </w:r>
-      <w:r>
-        <w:t xml:space="preserve">: la somma di </w:t>
-      </w:r>
-      <w:r>
-        <w:rPr>
-          <w:i/>
-          <w:iCs/>
-        </w:rPr>
-        <w:t>seek time</w:t>
-      </w:r>
-      <w:r>
-        <w:t xml:space="preserve"> e </w:t>
-      </w:r>
-      <w:r>
-        <w:rPr>
-          <w:i/>
-          <w:iCs/>
-        </w:rPr>
-        <w:t>latency</w:t>
-      </w:r>
-      <w:r>
-        <w:t>.</w:t>
-      </w:r>
-    </w:p>
-    <w:p>
-      <w:pPr>
-        <w:numPr>
-          <w:ilvl w:val="1"/>
-          <w:numId w:val="16"/>
-        </w:numPr>
-      </w:pPr>
-      <w:r>
-        <w:rPr>
-          <w:b/>
-          <w:bCs/>
-        </w:rPr>
-        <w:t>Transfer rate</w:t>
-      </w:r>
-      <w:r>
-        <w:t>: la velocità con cui i dati vengono trasferiti da o verso il disco.</w:t>
-      </w:r>
-    </w:p>
-    <w:p>
-      <w:pPr>
-        <w:numPr>
-          <w:ilvl w:val="0"/>
-          <w:numId w:val="16"/>
-        </w:numPr>
-      </w:pPr>
-      <w:r>
-        <w:rPr>
-          <w:b/>
-          <w:bCs/>
-        </w:rPr>
-        <w:t>Protezione e fluttuazione</w:t>
-      </w:r>
-      <w:r>
-        <w:t>: le testine non toccano mai fisicamente il piatto ma "fluttuano" su un cuscinetto d'aria a piccolissima distanza; per evitare guasti catastrofici (</w:t>
-      </w:r>
-      <w:r>
-        <w:rPr>
-          <w:i/>
-          <w:iCs/>
-        </w:rPr>
-        <w:t>head crash</w:t>
-      </w:r>
-      <w:r>
-        <w:t>) causati dalla polvere, i dischi rigidi sono sigillati in fabbrica.</w:t>
-      </w:r>
-    </w:p>
-    <w:p>
-      <w:pPr>
-        <w:pStyle w:val="Titolo2"/>
-        <w:rPr>
-          <w:b/>
-          <w:bCs/>
-          <w:color w:val="E97132" w:themeColor="accent2"/>
-        </w:rPr>
-      </w:pPr>
-      <w:r>
-        <w:rPr>
-          <w:b/>
-          <w:bCs/>
-          <w:color w:val="E97132" w:themeColor="accent2"/>
-        </w:rPr>
-        <w:t>Supporti Ottici (CD, DVD, Blu-Ray)</w:t>
-      </w:r>
-    </w:p>
-    <w:p>
-      <w:r>
-        <w:t>I dischi ottici memorizzano le informazioni alterando la riflettenza della superficie, letta poi mediante un raggio laser.</w:t>
-      </w:r>
-    </w:p>
-    <w:p>
-      <w:pPr>
-        <w:numPr>
-          <w:ilvl w:val="0"/>
-          <w:numId w:val="17"/>
-        </w:numPr>
-      </w:pPr>
-      <w:r>
-        <w:rPr>
-          <w:b/>
-          <w:bCs/>
-        </w:rPr>
-        <w:lastRenderedPageBreak/>
-        <w:t>Traccia a spirale</w:t>
-      </w:r>
-      <w:r>
-        <w:t>: a differenza degli HDD, nei CD e DVD i dati sono incisi su un'</w:t>
-      </w:r>
-      <w:r>
-        <w:rPr>
-          <w:b/>
-          <w:bCs/>
-        </w:rPr>
-        <w:t>unica traccia a spirale</w:t>
-      </w:r>
-      <w:r>
-        <w:t xml:space="preserve"> che parte dal centro e prosegue verso l'esterno. Questa conformazione è ottimale per flussi di dati continui (musica, video) ma presenta tempi di accesso casuale più alti rispetto ai dischi magnetici.</w:t>
-      </w:r>
-    </w:p>
-    <w:p>
-      <w:pPr>
-        <w:numPr>
-          <w:ilvl w:val="0"/>
-          <w:numId w:val="17"/>
-        </w:numPr>
-      </w:pPr>
-      <w:r>
-        <w:rPr>
-          <w:b/>
-          <w:bCs/>
-        </w:rPr>
-        <w:t>Tipologie</w:t>
-      </w:r>
-      <w:r>
-        <w:t xml:space="preserve">: i </w:t>
-      </w:r>
-      <w:r>
-        <w:rPr>
-          <w:b/>
-          <w:bCs/>
-        </w:rPr>
-        <w:t>CD</w:t>
-      </w:r>
-      <w:r>
-        <w:t xml:space="preserve"> tradizionali hanno capacità di 600–700 MB. I </w:t>
-      </w:r>
-      <w:r>
-        <w:rPr>
-          <w:b/>
-          <w:bCs/>
-        </w:rPr>
-        <w:t>DVD</w:t>
-      </w:r>
-      <w:r>
-        <w:t xml:space="preserve"> utilizzano laser a frequenza maggiore e strati multipli semitrasparenti per raggiungere capacità nell'ordine dei Gigabyte. I dischi </w:t>
-      </w:r>
-      <w:r>
-        <w:rPr>
-          <w:b/>
-          <w:bCs/>
-        </w:rPr>
-        <w:t>Blu-ray (BD)</w:t>
-      </w:r>
-      <w:r>
-        <w:t xml:space="preserve"> utilizzano un laser blu-violetto con una lunghezza d'onda inferiore, consentendo una messa a fuoco di altissima precisione e capacità superiori a 50 GB.</w:t>
-      </w:r>
-    </w:p>
-    <w:p>
-      <w:pPr>
-        <w:pStyle w:val="Titolo2"/>
-        <w:rPr>
-          <w:b/>
-          <w:bCs/>
-          <w:color w:val="E97132" w:themeColor="accent2"/>
-          <w:lang w:val="en-US"/>
-        </w:rPr>
-      </w:pPr>
-      <w:r>
-        <w:rPr>
-          <w:b/>
-          <w:bCs/>
-          <w:color w:val="E97132" w:themeColor="accent2"/>
-          <w:lang w:val="en-US"/>
-        </w:rPr>
-        <w:t>Memorie Flash ed SSD (Solid-State Drive)</w:t>
-      </w:r>
-    </w:p>
-    <w:p>
-      <w:r>
-        <w:t>Le memorie Flash eliminano qualsiasi componente meccanico in movimento, memorizzando i dati inviando segnali elettrici che catturano gli elettroni all'interno di microscopiche camere di diossido di silicio.</w:t>
-      </w:r>
-    </w:p>
-    <w:p>
-      <w:pPr>
-        <w:numPr>
-          <w:ilvl w:val="0"/>
-          <w:numId w:val="18"/>
-        </w:numPr>
-      </w:pPr>
-      <w:r>
-        <w:rPr>
-          <w:b/>
-          <w:bCs/>
-        </w:rPr>
-        <w:t>Vantaggi e Limiti</w:t>
-      </w:r>
-      <w:r>
-        <w:t>: offrono tempi di accesso minimi, resistenza agli urti e silenziosità. Tuttavia, i dati devono essere cancellati a grandi blocchi e le continue riscritture provocano un lento degrado fisico delle pareti di silicio.</w:t>
-      </w:r>
-    </w:p>
-    <w:p>
-      <w:pPr>
-        <w:numPr>
-          <w:ilvl w:val="0"/>
-          <w:numId w:val="18"/>
-        </w:numPr>
-      </w:pPr>
-      <w:r>
-        <w:rPr>
-          <w:b/>
-          <w:bCs/>
-        </w:rPr>
-        <w:t>Wear-Leveling</w:t>
-      </w:r>
-      <w:r>
-        <w:t xml:space="preserve">: negli </w:t>
-      </w:r>
-      <w:r>
-        <w:rPr>
-          <w:b/>
-          <w:bCs/>
-        </w:rPr>
-        <w:t>SSD</w:t>
-      </w:r>
-      <w:r>
-        <w:t xml:space="preserve"> (</w:t>
-      </w:r>
-      <w:r>
-        <w:rPr>
-          <w:i/>
-          <w:iCs/>
-        </w:rPr>
-        <w:t>Solid-State Drive</w:t>
-      </w:r>
-      <w:r>
-        <w:t xml:space="preserve">), destinati a rimpiazzare gli HDD nei computer, i controller integrati applicano la tecnica del </w:t>
-      </w:r>
-      <w:r>
-        <w:rPr>
-          <w:b/>
-          <w:bCs/>
-        </w:rPr>
-        <w:t>wear-leveling</w:t>
-      </w:r>
-      <w:r>
-        <w:t>, ridistribuendo continuamente i blocchi di dati riscritti frequentemente su celle diverse per uniformare l'usura ed estendere la durata del dispositivo.</w:t>
-      </w:r>
-    </w:p>
-    <w:p>
-      <w:pPr>
-        <w:numPr>
-          <w:ilvl w:val="0"/>
-          <w:numId w:val="18"/>
-        </w:numPr>
-      </w:pPr>
-      <w:r>
-        <w:rPr>
-          <w:b/>
-          <w:bCs/>
-        </w:rPr>
-        <w:t>Schede di memoria</w:t>
-      </w:r>
-      <w:r>
-        <w:t xml:space="preserve">: la tecnologia Flash è impiegata anche nelle schede </w:t>
-      </w:r>
-      <w:r>
-        <w:rPr>
-          <w:b/>
-          <w:bCs/>
-        </w:rPr>
-        <w:t>SD</w:t>
-      </w:r>
-      <w:r>
-        <w:t xml:space="preserve">, </w:t>
-      </w:r>
-      <w:r>
-        <w:rPr>
-          <w:b/>
-          <w:bCs/>
-        </w:rPr>
-        <w:t>SDHC</w:t>
-      </w:r>
-      <w:r>
-        <w:t xml:space="preserve"> (fino a 32 GB) e </w:t>
-      </w:r>
-      <w:r>
-        <w:rPr>
-          <w:b/>
-          <w:bCs/>
-        </w:rPr>
-        <w:t>SDXC</w:t>
-      </w:r>
-      <w:r>
-        <w:t xml:space="preserve"> (fino a oltre 1 TB), ampiamente usate in smartphone e fotocamere.</w:t>
-      </w:r>
-    </w:p>
-    <w:p/>
-    <w:p>
-      <w:pPr>
-        <w:pStyle w:val="Titolo1"/>
-        <w:rPr>
-          <w:b/>
-          <w:bCs/>
-          <w:color w:val="EE0000"/>
-        </w:rPr>
-      </w:pPr>
-      <w:r>
-        <w:rPr>
-          <w:b/>
-          <w:bCs/>
-          <w:color w:val="EE0000"/>
-        </w:rPr>
-        <w:t>6. Codifica E Rappresentazione Dei Dati</w:t>
-      </w:r>
-    </w:p>
-    <w:p>
-      <w:pPr>
-        <w:pStyle w:val="Titolo2"/>
-        <w:rPr>
-          <w:b/>
-          <w:bCs/>
-          <w:color w:val="E97132" w:themeColor="accent2"/>
-        </w:rPr>
-      </w:pPr>
-      <w:r>
-        <w:rPr>
-          <w:b/>
-          <w:bCs/>
-          <w:color w:val="E97132" w:themeColor="accent2"/>
-        </w:rPr>
         <w:t>Rappresentazione del Testo e dei Valori Numerici</w:t>
       </w:r>
     </w:p>
     <w:p>
-      <w:pPr>
-        <w:rPr>
-          <w:b/>
-          <w:bCs/>
-        </w:rPr>
-      </w:pPr>
-      <w:r>
-        <w:rPr>
-          <w:b/>
-          <w:bCs/>
-        </w:rPr>
-        <w:t>Codifica del Testo (ASCII, ISO e Unicode)</w:t>
-      </w:r>
-    </w:p>
-    <w:p>
-      <w:r>
-        <w:t>Per consentire a un calcolatore di elaborare testi scritti, ciascun simbolo (lettere maiuscole e minuscole, cifre, punteggiatura e caratteri di controllo) viene associato in modo univoco a uno specifico pattern di bit.</w:t>
-      </w:r>
-    </w:p>
-    <w:p>
-      <w:pPr>
-        <w:numPr>
-          <w:ilvl w:val="0"/>
-          <w:numId w:val="19"/>
-        </w:numPr>
-      </w:pPr>
-      <w:r>
-        <w:rPr>
-          <w:b/>
-          <w:bCs/>
-        </w:rPr>
-        <w:t>Codice ASCII</w:t>
-      </w:r>
-      <w:r>
-        <w:t>: sviluppato dall'ANSI (</w:t>
-      </w:r>
-      <w:r>
-        <w:rPr>
-          <w:i/>
-          <w:iCs/>
-        </w:rPr>
-        <w:t>American National Standards Institute</w:t>
-      </w:r>
-      <w:r>
-        <w:t xml:space="preserve">), lo standard </w:t>
-      </w:r>
-      <w:r>
-        <w:rPr>
-          <w:b/>
-          <w:bCs/>
-        </w:rPr>
-        <w:t>ASCII</w:t>
-      </w:r>
-      <w:r>
-        <w:t xml:space="preserve"> (</w:t>
-      </w:r>
-      <w:r>
-        <w:rPr>
-          <w:i/>
-          <w:iCs/>
-        </w:rPr>
-        <w:t>American Standard Code for Information Interchange</w:t>
-      </w:r>
-      <w:r>
-        <w:t xml:space="preserve">) utilizzava originariamente sequenze di </w:t>
-      </w:r>
-      <w:r>
-        <w:rPr>
-          <w:b/>
-          <w:bCs/>
-        </w:rPr>
-        <w:t>7 bit</w:t>
-      </w:r>
-      <w:r>
-        <w:t xml:space="preserve"> per codificare 128 simboli dell'alfabeto inglese. È stato successivamente esteso a </w:t>
-      </w:r>
-      <w:r>
-        <w:rPr>
-          <w:b/>
-          <w:bCs/>
-        </w:rPr>
-        <w:t>8 bit</w:t>
-      </w:r>
-      <w:r>
-        <w:t xml:space="preserve"> (un byte) aggiungendo un bit 0 nella posizione più significativa (MSB), rendendo disponibili ulteriori 128 combinazioni per simboli speciali ed estensioni.</w:t>
-      </w:r>
-    </w:p>
-    <w:p>
-      <w:pPr>
-        <w:numPr>
-          <w:ilvl w:val="0"/>
-          <w:numId w:val="19"/>
-        </w:numPr>
-      </w:pPr>
-      <w:r>
-        <w:rPr>
-          <w:b/>
-          <w:bCs/>
-        </w:rPr>
-        <w:t>Estensioni ISO</w:t>
-      </w:r>
-      <w:r>
-        <w:t xml:space="preserve">: l'organizzazione </w:t>
-      </w:r>
-      <w:r>
-        <w:rPr>
-          <w:b/>
-          <w:bCs/>
-        </w:rPr>
-        <w:t>ISO</w:t>
-      </w:r>
-      <w:r>
-        <w:t xml:space="preserve"> ha definito varie estensioni ad 8 bit per supportare i diversi gruppi linguistici (ad esempio le vocali accentate e i simboli monetari dell'Europa occidentale). Tuttavia, il limite massimo di 256 combinazioni rende impossibile rappresentare gli alfabeti complessi orientali o gestire documenti multilingue contemporaneamente.</w:t>
-      </w:r>
-    </w:p>
-    <w:p>
-      <w:pPr>
-        <w:numPr>
-          <w:ilvl w:val="0"/>
-          <w:numId w:val="19"/>
-        </w:numPr>
-      </w:pPr>
-      <w:r>
-        <w:rPr>
-          <w:b/>
-          <w:bCs/>
-        </w:rPr>
-        <w:t>Unicode e UTF-8</w:t>
-      </w:r>
-      <w:r>
-        <w:t xml:space="preserve">: per superare ogni barriera linguistica è nato lo standard </w:t>
-      </w:r>
-      <w:r>
-        <w:rPr>
-          <w:b/>
-          <w:bCs/>
-        </w:rPr>
-        <w:t>Unicode</w:t>
-      </w:r>
-      <w:r>
-        <w:t xml:space="preserve">, che assegna un codice univoco a ogni simbolo di tutti gli alfabeti del mondo utilizzando fino a 21 bit. Nella codifica </w:t>
-      </w:r>
-      <w:r>
-        <w:rPr>
-          <w:b/>
-          <w:bCs/>
-        </w:rPr>
-        <w:t>UTF-8</w:t>
-      </w:r>
-      <w:r>
-        <w:t xml:space="preserve">, i caratteri ASCII tradizionali mantengono la compatibilità occupando </w:t>
-      </w:r>
-      <w:r>
-        <w:lastRenderedPageBreak/>
-        <w:t>un singolo byte (8 bit), i caratteri delle altre lingue diffuse occupano 16 bit, mentre i simboli più rari o antichi impiegano 24 o 32 bit.</w:t>
+      <w:r>
+        <w:rPr/>
+        <w:t>La codifica del testo (codice ASCII, estensioni ISO, Unicode e UTF-8) è trattata nel capitolo 4: ogni simbolo è associato a uno specifico pattern di bit.</w:t>
       </w:r>
     </w:p>
     <w:p>
@@ -3813,47 +3216,8 @@
         <w:t>Immagini a Colori (RGB)</w:t>
       </w:r>
       <w:r>
-        <w:t>: si basa sulla sintesi additiva dei tre colori primari della luce (</w:t>
-      </w:r>
-      <w:r>
-        <w:rPr>
-          <w:b/>
-          <w:bCs/>
-        </w:rPr>
-        <w:t>Rosso</w:t>
-      </w:r>
-      <w:r>
-        <w:t xml:space="preserve">, </w:t>
-      </w:r>
-      <w:r>
-        <w:rPr>
-          <w:b/>
-          <w:bCs/>
-        </w:rPr>
-        <w:t>Verde</w:t>
-      </w:r>
-      <w:r>
-        <w:t xml:space="preserve"> e </w:t>
-      </w:r>
-      <w:r>
-        <w:rPr>
-          <w:b/>
-          <w:bCs/>
-        </w:rPr>
-        <w:t>Blu</w:t>
-      </w:r>
-      <w:r>
-        <w:t xml:space="preserve">). Assegnando 1 byte all'intensità di ciascun canale primario, ogni pixel richiede </w:t>
-      </w:r>
-      <w:r>
-        <w:rPr>
-          <w:b/>
-          <w:bCs/>
-        </w:rPr>
-        <w:t>3 byte (24 bit)</w:t>
-      </w:r>
-      <w:r>
-        <w:t xml:space="preserve"> di memoria, offrendo oltre 16,7 milioni di colori differenti.</w:t>
+        <w:rPr/>
+        <w:t>: ogni pixel richiede 3 byte (24 bit), con oltre 16,7 milioni di colori; il modello è descritto nel capitolo 4.</w:t>
       </w:r>
     </w:p>
     <w:p>

</xml_diff>

<commit_message>
Mate discreta: capitoli 16-19 (lezione 5, funzioni: composizione e inverse)
Co-Authored-By: Claude Sonnet 5.5 <noreply@anthropic.com>
</commit_message>
<xml_diff>
--- a/Fondamenti Info/Fondamenti Informatica.docx
+++ b/Fondamenti Info/Fondamenti Informatica.docx
@@ -1033,7 +1033,6 @@
         <w:t>, consentendone il recupero anche a computer spento.</w:t>
       </w:r>
       <w:r>
-        <w:rPr/>
         <w:t xml:space="preserve"> Per questo si parla anche di memoria secondaria, caratterizzata da non volatilità, alta capacità e costi contenuti.</w:t>
       </w:r>
     </w:p>
@@ -1204,7 +1203,6 @@
         <w:t>.</w:t>
       </w:r>
       <w:r>
-        <w:rPr/>
         <w:t xml:space="preserve"> Ogni settore contiene una quantità fissa di dati (tipicamente da 512 byte a pochi KB).</w:t>
       </w:r>
     </w:p>
@@ -1216,7 +1214,6 @@
         <w:t>Zoned-Bit Recording</w:t>
       </w:r>
       <w:r>
-        <w:rPr/>
         <w:t>: per ottimizzare lo spazio nei dischi ad alta capacità, le tracce esterne (più lunghe) contengono un numero maggiore di settori rispetto a quelle interne.</w:t>
       </w:r>
     </w:p>
@@ -1258,7 +1255,6 @@
         <w:t>Protezione dai guasti</w:t>
       </w:r>
       <w:r>
-        <w:rPr/>
         <w:t>: per evitare guasti catastrofici (head crash) causati dalla polvere, i dischi rigidi sono sigillati in fabbrica.</w:t>
       </w:r>
     </w:p>
@@ -1287,6 +1283,7 @@
           <w:iCs/>
           <w:highlight w:val="yellow"/>
         </w:rPr>
+        <w:lastRenderedPageBreak/>
         <w:t>Tempo di ricerca</w:t>
       </w:r>
       <w:r>
@@ -1366,7 +1363,6 @@
         <w:t>Velocità di trasferimento (Transfer Rate)</w:t>
       </w:r>
       <w:r>
-        <w:rPr/>
         <w:t>: la velocità con cui i dati vengono trasferiti da o verso il disco.</w:t>
       </w:r>
     </w:p>
@@ -1394,7 +1390,6 @@
           <w:bCs/>
           <w:color w:val="E97132" w:themeColor="accent2"/>
         </w:rPr>
-        <w:lastRenderedPageBreak/>
         <w:t>Supporti Ottici (CD, DVD, Blu-Ray)</w:t>
       </w:r>
     </w:p>
@@ -1574,7 +1569,6 @@
         </w:rPr>
         <w:t>precisione di focalizzazione molto più elevata e capacità oltre cinque volte quella di un DVD (25 GB a strato singolo, fino a 50 GB a doppio strato).</w:t>
       </w:r>
-      <w:r/>
     </w:p>
     <w:p>
       <w:pPr>
@@ -1619,7 +1613,6 @@
         <w:t>.</w:t>
       </w:r>
       <w:r>
-        <w:rPr/>
         <w:t xml:space="preserve"> Gli SSD (Solid-State Drive) sono destinati a rimpiazzare gli HDD nei computer.</w:t>
       </w:r>
     </w:p>
@@ -1736,10 +1729,10 @@
         <w:rPr>
           <w:b/>
         </w:rPr>
+        <w:lastRenderedPageBreak/>
         <w:t>Schede di memoria</w:t>
       </w:r>
       <w:r>
-        <w:rPr/>
         <w:t>: la tecnologia Flash è impiegata anche nelle schede SD, SDHC (fino a 32 GB) e SDXC (fino a oltre 1 TB), ampiamente usate in smartphone e fotocamere.</w:t>
       </w:r>
     </w:p>
@@ -1880,11 +1873,7 @@
         <w:t>7</w:t>
       </w:r>
       <w:r>
-        <w:t xml:space="preserve"> = 128 simboli dell'alfabeto inglese. Per </w:t>
-      </w:r>
-      <w:r>
-        <w:lastRenderedPageBreak/>
-        <w:t xml:space="preserve">integrarsi nei moderni calcolatori organizzati a byte, è stato successivamente portato a </w:t>
+        <w:t xml:space="preserve"> = 128 simboli dell'alfabeto inglese. Per integrarsi nei moderni calcolatori organizzati a byte, è stato successivamente portato a </w:t>
       </w:r>
       <w:r>
         <w:rPr>
@@ -1896,9 +1885,6 @@
       </w:r>
       <w:r>
         <w:t xml:space="preserve"> (aggiungendo uno 0 iniziale). Questo ha reso disponibili ulteriori 128 combinazioni per estensioni regionali.</w:t>
-      </w:r>
-      <w:r>
-        <w:rPr/>
       </w:r>
     </w:p>
     <w:p>
@@ -2225,6 +2211,7 @@
           <w:bCs/>
           <w:color w:val="EE0000"/>
         </w:rPr>
+        <w:lastRenderedPageBreak/>
         <w:t>5. Architettura e Memorizzazione dei Bit</w:t>
       </w:r>
     </w:p>
@@ -2356,7 +2343,6 @@
           <w:b/>
           <w:bCs/>
         </w:rPr>
-        <w:lastRenderedPageBreak/>
         <w:t>AND</w:t>
       </w:r>
       <w:r>
@@ -2650,7 +2636,11 @@
         <w:t>most significant bit (MSB)</w:t>
       </w:r>
       <w:r>
-        <w:t xml:space="preserve">, poiché rappresenta la cifra di peso maggiore in un'interpretazione numerica. Il bit all'estremità destra è detto </w:t>
+        <w:t xml:space="preserve">, </w:t>
+      </w:r>
+      <w:r>
+        <w:lastRenderedPageBreak/>
+        <w:t xml:space="preserve">poiché rappresenta la cifra di peso maggiore in un'interpretazione numerica. Il bit all'estremità destra è detto </w:t>
       </w:r>
       <w:r>
         <w:rPr>
@@ -2794,7 +2784,6 @@
           <w:b/>
           <w:bCs/>
         </w:rPr>
-        <w:lastRenderedPageBreak/>
         <w:t>RAM e DRAM</w:t>
       </w:r>
       <w:r>
@@ -2913,7 +2902,6 @@
     </w:p>
     <w:p>
       <w:r>
-        <w:rPr/>
         <w:t>La memoria di massa (dischi magnetici, supporti ottici, memorie Flash e SSD, schede di memoria) è descritta nel dettaglio nel capitolo 3: qui si ricorda solo che completa la memoria principale, limitata e volatile, con capacità elevate e conservazione permanente dei dati.</w:t>
       </w:r>
     </w:p>
@@ -2956,7 +2944,6 @@
     </w:p>
     <w:p>
       <w:r>
-        <w:rPr/>
         <w:t>La codifica del testo (codice ASCII, estensioni ISO, Unicode e UTF-8) è trattata nel capitolo 4: ogni simbolo è associato a uno specifico pattern di bit.</w:t>
       </w:r>
     </w:p>
@@ -3034,6 +3021,7 @@
           <w:bCs/>
           <w:color w:val="E97132" w:themeColor="accent2"/>
         </w:rPr>
+        <w:lastRenderedPageBreak/>
         <w:t>Rappresentazione dei Valori Numerici (ASCII vs Notazione Binaria)</w:t>
       </w:r>
     </w:p>
@@ -3213,7 +3201,6 @@
         <w:t>Immagini a Colori (RGB)</w:t>
       </w:r>
       <w:r>
-        <w:rPr/>
         <w:t>: ogni pixel richiede 3 byte (24 bit), con oltre 16,7 milioni di colori; il modello è descritto nel capitolo 4.</w:t>
       </w:r>
     </w:p>
@@ -3275,7 +3262,6 @@
           <w:bCs/>
           <w:color w:val="E97132" w:themeColor="accent2"/>
         </w:rPr>
-        <w:lastRenderedPageBreak/>
         <w:t>Limiti della Bitmap e Grafica Vettoriale</w:t>
       </w:r>
     </w:p>
@@ -3360,7 +3346,11 @@
         <w:t>PostScript</w:t>
       </w:r>
       <w:r>
-        <w:t xml:space="preserve"> (sviluppato da Adobe), per i disegni tecnici nei software </w:t>
+        <w:t xml:space="preserve"> (sviluppato da Adobe), </w:t>
+      </w:r>
+      <w:r>
+        <w:lastRenderedPageBreak/>
+        <w:t xml:space="preserve">per i disegni tecnici nei software </w:t>
       </w:r>
       <w:r>
         <w:rPr>
@@ -3761,6 +3751,7 @@
           <w:b/>
           <w:bCs/>
         </w:rPr>
+        <w:lastRenderedPageBreak/>
         <w:t>Valore assoluto di una sequenza</w:t>
       </w:r>
       <w:r>
@@ -4104,7 +4095,6 @@
         </w:numPr>
       </w:pPr>
       <w:r>
-        <w:lastRenderedPageBreak/>
         <w:t xml:space="preserve">13 ÷ 2 = 6 con resto </w:t>
       </w:r>
       <w:r>
@@ -4211,6 +4201,7 @@
           <w:bCs/>
           <w:color w:val="E97132" w:themeColor="accent2"/>
         </w:rPr>
+        <w:lastRenderedPageBreak/>
         <w:t>Aritmetica Binaria e Numeri Frazionari</w:t>
       </w:r>
     </w:p>
@@ -4396,14 +4387,6 @@
         </w:rPr>
         <w:t>Risultato finale: 110101 (corrispondente al valore decimale 53 = 26 + 27).</w:t>
       </w:r>
-      <w:r/>
-      <w:r>
-        <w:rPr>
-          <w:b/>
-          <w:bCs/>
-        </w:rPr>
-      </w:r>
-      <w:r/>
     </w:p>
     <w:p>
       <w:pPr>
@@ -4606,7 +4589,6 @@
         <w:rPr>
           <w:lang w:val="en-US"/>
         </w:rPr>
-        <w:lastRenderedPageBreak/>
         <w:t>Parte frazionaria .101: 1 × (1/2) + 0 × (1/4) + 1 × (1/8) = 1/2 + 1/8 = 5/8 = 0,625</w:t>
       </w:r>
     </w:p>
@@ -4672,6 +4654,7 @@
           <w:bCs/>
           <w:color w:val="EE0000"/>
         </w:rPr>
+        <w:lastRenderedPageBreak/>
         <w:t>8. Rappresentazione degli interi (complemento a due e eccesso)</w:t>
       </w:r>
     </w:p>
@@ -5043,7 +5026,6 @@
     </w:p>
     <w:p>
       <w:r>
-        <w:lastRenderedPageBreak/>
         <w:t xml:space="preserve">Nelle somme tra numeri in complemento a due, </w:t>
       </w:r>
       <w:r>
@@ -5189,6 +5171,7 @@
     </w:p>
     <w:p>
       <w:r>
+        <w:lastRenderedPageBreak/>
         <w:t>Considerando ad esempio la sottrazione 7 - 5 in un sistema a 4 bit, il minuendo +7 equivale alla stringa 0111. Il sottrando +5 (0101) viene convertito nel suo opposto -5 (1011). Eseguendo la somma binaria tra 0111 e 1011, si ottiene la sequenza a 5 bit 10010. Troncando il quinto bit di riporto a sinistra (1), la macchina trattiene la stringa a 4 bit 0010, che corrisponde esattamente al risultato corretto +2 in notazione decimale.</w:t>
       </w:r>
     </w:p>
@@ -5636,14 +5619,7 @@
         <w:rPr>
           <w:highlight w:val="yellow"/>
         </w:rPr>
-        <w:t xml:space="preserve">anche l'esatta </w:t>
-      </w:r>
-      <w:r>
-        <w:rPr>
-          <w:highlight w:val="yellow"/>
-        </w:rPr>
-        <w:lastRenderedPageBreak/>
-        <w:t xml:space="preserve">posizione del </w:t>
+        <w:t xml:space="preserve">anche l'esatta posizione del </w:t>
       </w:r>
       <w:r>
         <w:rPr>
@@ -5711,6 +5687,7 @@
           <w:b/>
           <w:bCs/>
         </w:rPr>
+        <w:lastRenderedPageBreak/>
         <w:t>Bit di segno (Sign Bit - 1 bit)</w:t>
       </w:r>
       <w:r>
@@ -6068,7 +6045,6 @@
           <w:bCs/>
           <w:color w:val="E97132" w:themeColor="accent2"/>
         </w:rPr>
-        <w:lastRenderedPageBreak/>
         <w:t>Errori di Troncamento e Proprietà dell'Aritmetica in Virgola Mobile</w:t>
       </w:r>
     </w:p>
@@ -6109,6 +6085,7 @@
     </w:p>
     <w:p>
       <w:r>
+        <w:lastRenderedPageBreak/>
         <w:t xml:space="preserve">Un'ulteriore sorgente di errore risiede negli </w:t>
       </w:r>
       <w:r>
@@ -6393,7 +6370,6 @@
           <w:b/>
           <w:bCs/>
         </w:rPr>
-        <w:lastRenderedPageBreak/>
         <w:t xml:space="preserve">Compressione </w:t>
       </w:r>
       <w:r>
@@ -6505,6 +6481,7 @@
           <w:b/>
           <w:bCs/>
         </w:rPr>
+        <w:lastRenderedPageBreak/>
         <w:t>Run-Length Encoding (RLE)</w:t>
       </w:r>
       <w:r>
@@ -6828,20 +6805,76 @@
     </w:p>
     <w:p>
       <w:r>
-        <w:t>I file multimediali richiedono un'occupazione di memoria particolarmente elevata, motivo per cui sono stati sviluppati standard di compressione specifici per ciascuna tipologia di media.</w:t>
-      </w:r>
-    </w:p>
-    <w:p>
-      <w:pPr>
-        <w:rPr>
-          <w:b/>
-          <w:bCs/>
-        </w:rPr>
-      </w:pPr>
-      <w:r>
-        <w:rPr>
-          <w:b/>
-          <w:bCs/>
+        <w:t xml:space="preserve">I </w:t>
+      </w:r>
+      <w:r>
+        <w:rPr>
+          <w:highlight w:val="yellow"/>
+        </w:rPr>
+        <w:t>file multimediali</w:t>
+      </w:r>
+      <w:r>
+        <w:t xml:space="preserve"> richiedono </w:t>
+      </w:r>
+      <w:r>
+        <w:t>un'</w:t>
+      </w:r>
+      <w:r>
+        <w:rPr>
+          <w:highlight w:val="yellow"/>
+        </w:rPr>
+        <w:t>occupazione di memoria particolarmente elevat</w:t>
+      </w:r>
+      <w:r>
+        <w:rPr>
+          <w:highlight w:val="yellow"/>
+        </w:rPr>
+        <w:t>a</w:t>
+      </w:r>
+      <w:r>
+        <w:t xml:space="preserve">, motivo per cui sono stati sviluppati </w:t>
+      </w:r>
+      <w:r>
+        <w:rPr>
+          <w:highlight w:val="yellow"/>
+        </w:rPr>
+        <w:t>standard</w:t>
+      </w:r>
+      <w:r>
+        <w:t xml:space="preserve"> di compressione </w:t>
+      </w:r>
+      <w:r>
+        <w:rPr>
+          <w:highlight w:val="yellow"/>
+        </w:rPr>
+        <w:t>specifici</w:t>
+      </w:r>
+      <w:r>
+        <w:t xml:space="preserve"> per </w:t>
+      </w:r>
+      <w:r>
+        <w:rPr>
+          <w:highlight w:val="yellow"/>
+        </w:rPr>
+        <w:t>ciascuna tipologia di media</w:t>
+      </w:r>
+      <w:r>
+        <w:t>.</w:t>
+      </w:r>
+    </w:p>
+    <w:p>
+      <w:pPr>
+        <w:rPr>
+          <w:b/>
+          <w:bCs/>
+          <w:color w:val="E97132" w:themeColor="accent2"/>
+        </w:rPr>
+      </w:pPr>
+      <w:r>
+        <w:rPr>
+          <w:b/>
+          <w:bCs/>
+          <w:color w:val="E97132" w:themeColor="accent2"/>
         </w:rPr>
         <w:t>Compressione delle Immagini: GIF, JPEG e TIFF</w:t>
       </w:r>
@@ -6852,15 +6885,40 @@
           <w:b/>
           <w:bCs/>
         </w:rPr>
-        <w:t>Formato GIF (Graphic Interchange Format)</w:t>
-      </w:r>
-      <w:r>
-        <w:t xml:space="preserve">: sviluppato da CompuServe per le immagini bitmap, è un sistema a dizionario che riduce i colori rappresentabili a un massimo di </w:t>
-      </w:r>
-      <w:r>
-        <w:rPr>
-          <w:b/>
-          <w:bCs/>
+        <w:t xml:space="preserve">Formato </w:t>
+      </w:r>
+      <w:r>
+        <w:rPr>
+          <w:b/>
+          <w:bCs/>
+          <w:highlight w:val="yellow"/>
+        </w:rPr>
+        <w:t>GIF</w:t>
+      </w:r>
+      <w:r>
+        <w:rPr>
+          <w:b/>
+          <w:bCs/>
+        </w:rPr>
+        <w:t xml:space="preserve"> (Graphic Interchange Format)</w:t>
+      </w:r>
+      <w:r>
+        <w:t xml:space="preserve">: sviluppato da CompuServe per le immagini bitmap, è un sistema a dizionario che </w:t>
+      </w:r>
+      <w:r>
+        <w:rPr>
+          <w:highlight w:val="yellow"/>
+        </w:rPr>
+        <w:t>riduce i colori rappresentabili</w:t>
+      </w:r>
+      <w:r>
+        <w:t xml:space="preserve"> a un massimo di </w:t>
+      </w:r>
+      <w:r>
+        <w:rPr>
+          <w:b/>
+          <w:bCs/>
+          <w:highlight w:val="yellow"/>
         </w:rPr>
         <w:t>256 tonalità</w:t>
       </w:r>
@@ -6875,11 +6933,25 @@
         <w:t>palette</w:t>
       </w:r>
       <w:r>
-        <w:t xml:space="preserve"> è codificato a 24 bit (3 byte RGB), e ogni pixel dell'immagine richiede un solo byte contenente l'indice del colore corrispondente nella palette. GIF applica la compressione LZW per </w:t>
-      </w:r>
-      <w:r>
-        <w:lastRenderedPageBreak/>
-        <w:t xml:space="preserve">un'ulteriore riduzione dello spazio. Risulta una tecnica </w:t>
+        <w:t xml:space="preserve"> è codificato a 24 bit (3 byte RGB), e </w:t>
+      </w:r>
+      <w:r>
+        <w:rPr>
+          <w:highlight w:val="yellow"/>
+        </w:rPr>
+        <w:t>ogni pixel dell'immagine richiede un solo byte contenente l'indice del colore corrispondente nella palette</w:t>
+      </w:r>
+      <w:r>
+        <w:t xml:space="preserve">. GIF applica la </w:t>
+      </w:r>
+      <w:r>
+        <w:rPr>
+          <w:highlight w:val="yellow"/>
+        </w:rPr>
+        <w:t>compressione LZW</w:t>
+      </w:r>
+      <w:r>
+        <w:t xml:space="preserve"> per un'ulteriore riduzione dello spazio. Risulta una tecnica </w:t>
       </w:r>
       <w:r>
         <w:rPr>
@@ -6899,7 +6971,16 @@
         <w:t>lossless</w:t>
       </w:r>
       <w:r>
-        <w:t xml:space="preserve"> per grafiche semplici. Permette inoltre di impostare un colore come trasparente, rendendolo lo standard d'elezione per semplici animazioni grafiche.</w:t>
+        <w:t xml:space="preserve"> per grafiche semplici. </w:t>
+      </w:r>
+      <w:r>
+        <w:rPr>
+          <w:highlight w:val="yellow"/>
+        </w:rPr>
+        <w:t>Permette inoltre di impostare un colore come trasparente</w:t>
+      </w:r>
+      <w:r>
+        <w:t>, rendendolo lo standard d'elezione per semplici animazioni grafiche.</w:t>
       </w:r>
     </w:p>
     <w:p>
@@ -6911,7 +6992,25 @@
         <w:t>Formato JPEG (Joint Photographic Experts Group)</w:t>
       </w:r>
       <w:r>
-        <w:t xml:space="preserve">: sviluppato all'interno dell'ISO, costituisce lo standard di riferimento per la compressione delle fotografie a colori ad alta definizione. Sebbene preveda una modalità </w:t>
+        <w:t xml:space="preserve">: sviluppato all'interno dell'ISO, costituisce lo </w:t>
+      </w:r>
+      <w:r>
+        <w:rPr>
+          <w:highlight w:val="yellow"/>
+        </w:rPr>
+        <w:t>standard</w:t>
+      </w:r>
+      <w:r>
+        <w:t xml:space="preserve"> di riferimento per la </w:t>
+      </w:r>
+      <w:r>
+        <w:rPr>
+          <w:highlight w:val="yellow"/>
+        </w:rPr>
+        <w:t>compressione delle fotografie a colori ad alta definizione</w:t>
+      </w:r>
+      <w:r>
+        <w:t xml:space="preserve">. Sebbene preveda una modalità </w:t>
       </w:r>
       <w:r>
         <w:rPr>
@@ -6927,356 +7026,445 @@
         <w:rPr>
           <w:b/>
           <w:bCs/>
+          <w:highlight w:val="yellow"/>
         </w:rPr>
         <w:t>JPEG Baseline Standard</w:t>
       </w:r>
       <w:r>
-        <w:t xml:space="preserve"> (</w:t>
+        <w:t xml:space="preserve"> </w:t>
+      </w:r>
+      <w:r>
+        <w:lastRenderedPageBreak/>
+        <w:t>(</w:t>
       </w:r>
       <w:r>
         <w:rPr>
           <w:i/>
           <w:iCs/>
-        </w:rPr>
-        <w:t>lossy sequential</w:t>
-      </w:r>
-      <w:r>
-        <w:t>). Il procedimento si articola in varie fasi e sfrutta i limiti del sistema visivo umano, maggiormente sensibile alle variazioni di luminosità (</w:t>
-      </w:r>
-      <w:r>
-        <w:rPr>
-          <w:b/>
-          <w:bCs/>
-        </w:rPr>
-        <w:t>luminanza</w:t>
-      </w:r>
-      <w:r>
-        <w:t>) rispetto alle variazioni cromatiche (</w:t>
-      </w:r>
-      <w:r>
-        <w:rPr>
-          <w:b/>
-          <w:bCs/>
-        </w:rPr>
-        <w:t>crominanza</w:t>
-      </w:r>
-      <w:r>
-        <w:t xml:space="preserve">): </w:t>
-      </w:r>
-    </w:p>
-    <w:p>
-      <w:pPr>
-        <w:numPr>
-          <w:ilvl w:val="0"/>
-          <w:numId w:val="39"/>
-        </w:numPr>
-      </w:pPr>
+          <w:highlight w:val="yellow"/>
+        </w:rPr>
+        <w:t>lossy</w:t>
+      </w:r>
       <w:r>
         <w:rPr>
           <w:i/>
           <w:iCs/>
         </w:rPr>
-        <w:t>Sottocampionamento della crominanza</w:t>
-      </w:r>
-      <w:r>
-        <w:t>: i valori cromatici vengono mediati su blocchi di 2 × 2 pixel, riducendo l'informazione cromatica di un fattore 4 senza cali visibili di qualità.</w:t>
-      </w:r>
-    </w:p>
-    <w:p>
-      <w:pPr>
-        <w:numPr>
-          <w:ilvl w:val="0"/>
-          <w:numId w:val="39"/>
-        </w:numPr>
-      </w:pPr>
+        <w:t xml:space="preserve"> sequential</w:t>
+      </w:r>
+      <w:r>
+        <w:t xml:space="preserve">). Il </w:t>
+      </w:r>
+      <w:r>
+        <w:rPr>
+          <w:highlight w:val="yellow"/>
+        </w:rPr>
+        <w:t>procedimento si articola in varie fasi e sfrutta i limiti del sistema visivo umano</w:t>
+      </w:r>
+      <w:r>
+        <w:t xml:space="preserve">, </w:t>
+      </w:r>
+      <w:r>
+        <w:rPr>
+          <w:highlight w:val="yellow"/>
+        </w:rPr>
+        <w:t>maggiormente sensibile alle variazioni di luminosità</w:t>
+      </w:r>
+      <w:r>
+        <w:t xml:space="preserve"> (</w:t>
+      </w:r>
+      <w:r>
+        <w:rPr>
+          <w:b/>
+          <w:bCs/>
+        </w:rPr>
+        <w:t>luminanza</w:t>
+      </w:r>
+      <w:r>
+        <w:t>) rispetto alle variazioni cromatiche (</w:t>
+      </w:r>
+      <w:r>
+        <w:rPr>
+          <w:b/>
+          <w:bCs/>
+        </w:rPr>
+        <w:t>crominanza</w:t>
+      </w:r>
+      <w:r>
+        <w:t>)</w:t>
+      </w:r>
+    </w:p>
+    <w:p>
+      <w:r>
+        <w:rPr>
+          <w:b/>
+          <w:bCs/>
+        </w:rPr>
+        <w:t>Formato TIFF (</w:t>
+      </w:r>
+      <w:proofErr w:type="spellStart"/>
+      <w:r>
+        <w:rPr>
+          <w:b/>
+          <w:bCs/>
+        </w:rPr>
+        <w:t>Tagged</w:t>
+      </w:r>
+      <w:proofErr w:type="spellEnd"/>
+      <w:r>
+        <w:rPr>
+          <w:b/>
+          <w:bCs/>
+        </w:rPr>
+        <w:t xml:space="preserve"> Image File Format)</w:t>
+      </w:r>
+      <w:r>
+        <w:t xml:space="preserve">: utilizzato principalmente per </w:t>
+      </w:r>
+      <w:r>
+        <w:rPr>
+          <w:highlight w:val="yellow"/>
+        </w:rPr>
+        <w:t>archiviare fotografie ad altissima fedeltà non compresse</w:t>
+      </w:r>
+      <w:r>
+        <w:t xml:space="preserve"> (in formato RGB puro) </w:t>
+      </w:r>
+      <w:r>
+        <w:rPr>
+          <w:highlight w:val="yellow"/>
+        </w:rPr>
+        <w:t>insieme</w:t>
+      </w:r>
+      <w:r>
+        <w:rPr>
+          <w:highlight w:val="yellow"/>
+        </w:rPr>
+        <w:t xml:space="preserve"> ai relativi metadati</w:t>
+      </w:r>
+      <w:r>
+        <w:t xml:space="preserve"> (data, ora, impostazioni della fotocamera). </w:t>
+      </w:r>
+    </w:p>
+    <w:p>
+      <w:pPr>
+        <w:pStyle w:val="Titolo2"/>
+        <w:rPr>
+          <w:b/>
+          <w:bCs/>
+          <w:color w:val="E97132" w:themeColor="accent2"/>
+        </w:rPr>
+      </w:pPr>
+      <w:r>
+        <w:rPr>
+          <w:b/>
+          <w:bCs/>
+          <w:color w:val="E97132" w:themeColor="accent2"/>
+        </w:rPr>
+        <w:t>Compressione Audio e Video: MPEG e MP3</w:t>
+      </w:r>
+    </w:p>
+    <w:p>
+      <w:r>
+        <w:rPr>
+          <w:b/>
+          <w:bCs/>
+        </w:rPr>
+        <w:t>Standard MPEG (Motion Picture Experts Group)</w:t>
+      </w:r>
+      <w:r>
+        <w:t xml:space="preserve">: sviluppato sotto la guida dell'ISO per la </w:t>
+      </w:r>
+      <w:r>
+        <w:rPr>
+          <w:highlight w:val="yellow"/>
+        </w:rPr>
+        <w:t>compressione di flussi video e audio</w:t>
+      </w:r>
+      <w:r>
+        <w:t xml:space="preserve">. Nei filmati video, concepiti come sequenze di immagini, </w:t>
+      </w:r>
+      <w:r>
+        <w:rPr>
+          <w:highlight w:val="yellow"/>
+        </w:rPr>
+        <w:t>soltanto alcuni fotogrammi chiave</w:t>
+      </w:r>
+      <w:r>
+        <w:t xml:space="preserve"> (</w:t>
+      </w:r>
+      <w:r>
+        <w:rPr>
+          <w:b/>
+          <w:bCs/>
+        </w:rPr>
+        <w:t>I-frame</w:t>
+      </w:r>
+      <w:r>
+        <w:t xml:space="preserve">) </w:t>
+      </w:r>
+      <w:r>
+        <w:rPr>
+          <w:highlight w:val="yellow"/>
+        </w:rPr>
+        <w:t>vengono codificati integralmente</w:t>
+      </w:r>
+      <w:r>
+        <w:t xml:space="preserve"> con tecniche simili a JPEG. I </w:t>
+      </w:r>
+      <w:r>
+        <w:rPr>
+          <w:highlight w:val="yellow"/>
+        </w:rPr>
+        <w:t>fotogrammi intermedi</w:t>
+      </w:r>
+      <w:r>
+        <w:t xml:space="preserve"> tra gli I-frame vengono invece </w:t>
+      </w:r>
+      <w:r>
+        <w:rPr>
+          <w:highlight w:val="yellow"/>
+        </w:rPr>
+        <w:t>compressi mediante codifica relativa</w:t>
+      </w:r>
+      <w:r>
+        <w:t xml:space="preserve">, </w:t>
+      </w:r>
+      <w:r>
+        <w:rPr>
+          <w:highlight w:val="yellow"/>
+        </w:rPr>
+        <w:t>registrando esclusivamente le differenze</w:t>
+      </w:r>
+      <w:r>
+        <w:t xml:space="preserve"> rispetto all'immagine precedente.</w:t>
+      </w:r>
+    </w:p>
+    <w:p>
+      <w:r>
+        <w:rPr>
+          <w:b/>
+          <w:bCs/>
+        </w:rPr>
+        <w:t>Standard MP3 (MPEG Layer 3)</w:t>
+      </w:r>
+      <w:r>
+        <w:t xml:space="preserve">: formato di </w:t>
+      </w:r>
+      <w:r>
+        <w:t>compressione audio</w:t>
+      </w:r>
+      <w:r>
+        <w:t xml:space="preserve"> </w:t>
+      </w:r>
+      <w:r>
+        <w:rPr>
+          <w:highlight w:val="yellow"/>
+        </w:rPr>
+        <w:t>appartenente agli standard MPEG</w:t>
+      </w:r>
+      <w:r>
+        <w:t xml:space="preserve"> che </w:t>
+      </w:r>
+      <w:r>
+        <w:rPr>
+          <w:highlight w:val="yellow"/>
+        </w:rPr>
+        <w:t>riduce significativamente</w:t>
+      </w:r>
+      <w:r>
+        <w:t xml:space="preserve"> la dimensione dei file audio </w:t>
+      </w:r>
+      <w:r>
+        <w:rPr>
+          <w:highlight w:val="yellow"/>
+        </w:rPr>
+        <w:t>mantenendo una qualità prossima a quella di un CD</w:t>
+      </w:r>
+      <w:r>
+        <w:t xml:space="preserve">. Funziona </w:t>
+      </w:r>
+      <w:r>
+        <w:rPr>
+          <w:highlight w:val="yellow"/>
+        </w:rPr>
+        <w:t>eliminando i suoni impercettibili per l'orecchio umano</w:t>
+      </w:r>
+      <w:r>
+        <w:t xml:space="preserve"> sfruttando due principi psicoacustici</w:t>
+      </w:r>
+    </w:p>
+    <w:p>
+      <w:r>
+        <w:rPr>
+          <w:b/>
+          <w:bCs/>
+        </w:rPr>
+        <w:t>Tassi di Trasmissione</w:t>
+      </w:r>
+      <w:r>
+        <w:t xml:space="preserve">: per la fruizione tempestiva in rete, i flussi video MPEG richiedono velocità di trasferimento fino a </w:t>
+      </w:r>
+      <w:r>
+        <w:rPr>
+          <w:b/>
+          <w:bCs/>
+        </w:rPr>
+        <w:t>40 Mbps</w:t>
+      </w:r>
+      <w:r>
+        <w:t xml:space="preserve">, mentre le tracce audio MP3 necessitano di tassi non superiori a </w:t>
+      </w:r>
+      <w:r>
+        <w:rPr>
+          <w:b/>
+          <w:bCs/>
+        </w:rPr>
+        <w:t>64 Kbps</w:t>
+      </w:r>
+      <w:r>
+        <w:t>.</w:t>
+      </w:r>
+    </w:p>
+    <w:p/>
+    <w:p>
+      <w:pPr>
+        <w:pStyle w:val="Titolo1"/>
+        <w:rPr>
+          <w:b/>
+          <w:bCs/>
+          <w:color w:val="EE0000"/>
+        </w:rPr>
+      </w:pPr>
+      <w:r>
+        <w:rPr>
+          <w:b/>
+          <w:bCs/>
+          <w:color w:val="EE0000"/>
+        </w:rPr>
+        <w:t xml:space="preserve">11. </w:t>
+      </w:r>
+      <w:r>
+        <w:rPr>
+          <w:b/>
+          <w:bCs/>
+          <w:color w:val="EE0000"/>
+        </w:rPr>
+        <w:t>G</w:t>
+      </w:r>
+      <w:r>
+        <w:rPr>
+          <w:b/>
+          <w:bCs/>
+          <w:color w:val="EE0000"/>
+        </w:rPr>
+        <w:t>estione e correzione degli errori di comunicazione</w:t>
+      </w:r>
+    </w:p>
+    <w:p>
+      <w:pPr>
+        <w:pStyle w:val="Titolo2"/>
+        <w:rPr>
+          <w:b/>
+          <w:bCs/>
+          <w:color w:val="E97132" w:themeColor="accent2"/>
+        </w:rPr>
+      </w:pPr>
+      <w:r>
+        <w:rPr>
+          <w:b/>
+          <w:bCs/>
+          <w:color w:val="E97132" w:themeColor="accent2"/>
+        </w:rPr>
+        <w:t>Rilevamento degli Errori e Bit di Parità</w:t>
+      </w:r>
+    </w:p>
+    <w:p>
+      <w:r>
+        <w:t xml:space="preserve">Durante il trasferimento dei dati tra le varie componenti interne di un calcolatore, la trasmissione a distanza o la semplice permanenza delle informazioni nei dispositivi di memorizzazione, </w:t>
+      </w:r>
+      <w:r>
+        <w:rPr>
+          <w:highlight w:val="yellow"/>
+        </w:rPr>
+        <w:t>esiste costantemente il rischio che i pattern di bit vengano alterati</w:t>
+      </w:r>
+      <w:r>
+        <w:t xml:space="preserve">. Sporcizia o grasso sulle superfici magnetiche, malfunzionamenti dei circuiti, interferenze statiche sui canali di trasmissione e persino la radiazione di fondo nelle memorie RAM possono invertire inavvertitamente lo stato di uno o più bit. Per garantire la massima affidabilità del sistema senza richiedere l'intervento dell'utente, </w:t>
+      </w:r>
+      <w:r>
+        <w:rPr>
+          <w:highlight w:val="yellow"/>
+        </w:rPr>
+        <w:t>l'hardware integra sofisticate tecniche di codifica volte a rilevare e correggere tali anomalie</w:t>
+      </w:r>
+      <w:r>
+        <w:t>.</w:t>
+      </w:r>
+    </w:p>
+    <w:p>
+      <w:r>
+        <w:t xml:space="preserve">La </w:t>
+      </w:r>
+      <w:r>
+        <w:rPr>
+          <w:highlight w:val="yellow"/>
+        </w:rPr>
+        <w:t>str</w:t>
+      </w:r>
+      <w:r>
+        <w:rPr>
+          <w:highlight w:val="yellow"/>
+        </w:rPr>
+        <w:t>ategia di rilevamento più semplice si basa sul principio della parità</w:t>
+      </w:r>
+      <w:r>
+        <w:t xml:space="preserve">. </w:t>
+      </w:r>
+      <w:r>
+        <w:rPr>
+          <w:highlight w:val="yellow"/>
+        </w:rPr>
+        <w:t xml:space="preserve">Aggiungendo un bit supplementare, denominato </w:t>
+      </w:r>
+      <w:r>
+        <w:rPr>
+          <w:b/>
+          <w:bCs/>
+          <w:highlight w:val="yellow"/>
+        </w:rPr>
+        <w:t>bit di parità</w:t>
+      </w:r>
+      <w:r>
+        <w:t xml:space="preserve"> (</w:t>
+      </w:r>
+      <w:proofErr w:type="spellStart"/>
       <w:r>
         <w:rPr>
           <w:i/>
           <w:iCs/>
         </w:rPr>
-        <w:t>Trasformata Discreta del Coseno (DCT)</w:t>
-      </w:r>
-      <w:r>
-        <w:t>: l'immagine viene suddivisa in blocchi di 8 × 8 pixel e convertita tramite DCT in coefficienti di frequenza spaziale.</w:t>
-      </w:r>
-    </w:p>
-    <w:p>
-      <w:pPr>
-        <w:numPr>
-          <w:ilvl w:val="0"/>
-          <w:numId w:val="39"/>
-        </w:numPr>
-      </w:pPr>
+        <w:t>parity</w:t>
+      </w:r>
+      <w:proofErr w:type="spellEnd"/>
       <w:r>
         <w:rPr>
           <w:i/>
           <w:iCs/>
         </w:rPr>
-        <w:t>Quantizzazione</w:t>
-      </w:r>
-      <w:r>
-        <w:t>: i valori inferiori a una determinata soglia di percezione visiva vengono sostituiti da zeri.</w:t>
-      </w:r>
-    </w:p>
-    <w:p>
-      <w:pPr>
-        <w:numPr>
-          <w:ilvl w:val="0"/>
-          <w:numId w:val="39"/>
-        </w:numPr>
-      </w:pPr>
-      <w:r>
-        <w:rPr>
-          <w:i/>
-          <w:iCs/>
-        </w:rPr>
-        <w:t>Compressione finale</w:t>
-      </w:r>
-      <w:r>
-        <w:t xml:space="preserve">: sul blocco risultante si applicano RLE, codifica relativa e codifica a lunghezza variabile, ottenendo fattori di compressione da </w:t>
-      </w:r>
-      <w:r>
-        <w:rPr>
-          <w:b/>
-          <w:bCs/>
-        </w:rPr>
-        <w:t>10:1 fino a 30:1</w:t>
-      </w:r>
-      <w:r>
-        <w:t xml:space="preserve"> senza perdita percepibile di qualità.</w:t>
-      </w:r>
-    </w:p>
-    <w:p>
-      <w:r>
-        <w:rPr>
-          <w:b/>
-          <w:bCs/>
-        </w:rPr>
-        <w:t>Formato TIFF (Tagged Image File Format)</w:t>
-      </w:r>
-      <w:r>
-        <w:t>: utilizzato principalmente per archiviare fotografie ad altissima fedeltà non compresse (in formato RGB puro) unitamente ai relativi metadati (data, ora, impostazioni della fotocamera). Comprende anche opzioni di compressione basate su RLE per la trasmissione di documenti di testo in telefax.</w:t>
-      </w:r>
-    </w:p>
-    <w:p>
-      <w:pPr>
-        <w:pStyle w:val="Titolo2"/>
-        <w:rPr>
-          <w:b/>
-          <w:bCs/>
-          <w:color w:val="E97132" w:themeColor="accent2"/>
-        </w:rPr>
-      </w:pPr>
-      <w:r>
-        <w:rPr>
-          <w:b/>
-          <w:bCs/>
-          <w:color w:val="E97132" w:themeColor="accent2"/>
-        </w:rPr>
-        <w:t>Compressione Audio e Video: MPEG e MP3</w:t>
-      </w:r>
-    </w:p>
-    <w:p>
-      <w:pPr>
-        <w:numPr>
-          <w:ilvl w:val="0"/>
-          <w:numId w:val="40"/>
-        </w:numPr>
-      </w:pPr>
-      <w:r>
-        <w:rPr>
-          <w:b/>
-          <w:bCs/>
-        </w:rPr>
-        <w:t>Standard MPEG (Motion Picture Experts Group)</w:t>
-      </w:r>
-      <w:r>
-        <w:t>: sviluppato sotto la guida dell'ISO per la compressione di flussi video e audio. Nei filmati video, concepiti come sequenze di immagini, soltanto alcuni fotogrammi chiave (</w:t>
-      </w:r>
-      <w:r>
-        <w:rPr>
-          <w:b/>
-          <w:bCs/>
-        </w:rPr>
-        <w:t>I-frame</w:t>
-      </w:r>
-      <w:r>
-        <w:t>) vengono codificati integralmente con tecniche simili a JPEG. I fotogrammi intermedi tra gli I-frame vengono invece compressi mediante codifica relativa, registrando esclusivamente le differenze rispetto all'immagine precedente.</w:t>
-      </w:r>
-    </w:p>
-    <w:p>
-      <w:pPr>
-        <w:numPr>
-          <w:ilvl w:val="0"/>
-          <w:numId w:val="40"/>
-        </w:numPr>
-      </w:pPr>
-      <w:r>
-        <w:rPr>
-          <w:b/>
-          <w:bCs/>
-        </w:rPr>
-        <w:t>Standard MP3 (MPEG Layer 3)</w:t>
-      </w:r>
-      <w:r>
-        <w:t xml:space="preserve">: formato di compressione audio appartenente agli standard MPEG che riduce significativamente la dimensione dei file audio mantenendo una qualità prossima a quella di un CD. Funziona eliminando i suoni impercettibili per l'orecchio umano sfruttando due principi psicoacustici: </w:t>
-      </w:r>
-    </w:p>
-    <w:p>
-      <w:pPr>
-        <w:numPr>
-          <w:ilvl w:val="1"/>
-          <w:numId w:val="40"/>
-        </w:numPr>
-      </w:pPr>
-      <w:r>
-        <w:rPr>
-          <w:i/>
-          <w:iCs/>
-        </w:rPr>
-        <w:t>Mascheramento Temporale</w:t>
-      </w:r>
-      <w:r>
-        <w:t>: per un breve intervallo dopo un suono ad alto volume, l'orecchio non rileva suoni più deboli che seguono.</w:t>
-      </w:r>
-    </w:p>
-    <w:p>
-      <w:pPr>
-        <w:numPr>
-          <w:ilvl w:val="1"/>
-          <w:numId w:val="40"/>
-        </w:numPr>
-      </w:pPr>
-      <w:r>
-        <w:rPr>
-          <w:i/>
-          <w:iCs/>
-        </w:rPr>
-        <w:t>Mascheramento in Frequenza</w:t>
-      </w:r>
-      <w:r>
-        <w:t>: un suono a una determinata frequenza maschera i suoni più deboli a frequenze vicine.</w:t>
-      </w:r>
-    </w:p>
-    <w:p>
-      <w:pPr>
-        <w:numPr>
-          <w:ilvl w:val="0"/>
-          <w:numId w:val="40"/>
-        </w:numPr>
-      </w:pPr>
-      <w:r>
-        <w:rPr>
-          <w:b/>
-          <w:bCs/>
-        </w:rPr>
-        <w:t>Tassi di Trasmissione</w:t>
-      </w:r>
-      <w:r>
-        <w:t xml:space="preserve">: per la fruizione tempestiva in rete, i flussi video MPEG richiedono velocità di trasferimento fino a </w:t>
-      </w:r>
-      <w:r>
-        <w:rPr>
-          <w:b/>
-          <w:bCs/>
-        </w:rPr>
-        <w:t>40 Mbps</w:t>
-      </w:r>
-      <w:r>
-        <w:t xml:space="preserve">, mentre le tracce audio MP3 necessitano di tassi non superiori a </w:t>
-      </w:r>
-      <w:r>
-        <w:rPr>
-          <w:b/>
-          <w:bCs/>
-        </w:rPr>
-        <w:t>64 Kbps</w:t>
-      </w:r>
-      <w:r>
-        <w:t>.</w:t>
-      </w:r>
-    </w:p>
-    <w:p/>
-    <w:p>
-      <w:pPr>
-        <w:pStyle w:val="Titolo1"/>
-        <w:rPr>
-          <w:b/>
-          <w:bCs/>
-          <w:color w:val="EE0000"/>
-        </w:rPr>
-      </w:pPr>
-      <w:r>
-        <w:rPr>
-          <w:b/>
-          <w:bCs/>
-          <w:color w:val="EE0000"/>
-        </w:rPr>
-        <w:t xml:space="preserve">11. </w:t>
-      </w:r>
-      <w:r>
-        <w:rPr>
-          <w:b/>
-          <w:bCs/>
-          <w:color w:val="EE0000"/>
-        </w:rPr>
-        <w:t>G</w:t>
-      </w:r>
-      <w:r>
-        <w:rPr>
-          <w:b/>
-          <w:bCs/>
-          <w:color w:val="EE0000"/>
-        </w:rPr>
-        <w:t>estione e correzione degli errori di comunicazione</w:t>
-      </w:r>
-    </w:p>
-    <w:p>
-      <w:pPr>
-        <w:pStyle w:val="Titolo2"/>
-        <w:rPr>
-          <w:b/>
-          <w:bCs/>
-          <w:color w:val="E97132" w:themeColor="accent2"/>
-        </w:rPr>
-      </w:pPr>
-      <w:r>
-        <w:rPr>
-          <w:b/>
-          <w:bCs/>
-          <w:color w:val="E97132" w:themeColor="accent2"/>
-        </w:rPr>
-        <w:t>Rilevamento degli Errori e Bit di Parità</w:t>
-      </w:r>
-    </w:p>
-    <w:p>
-      <w:r>
-        <w:t>Durante il trasferimento dei dati tra le varie componenti interne di un calcolatore, la trasmissione a distanza o la semplice permanenza delle informazioni nei dispositivi di memorizzazione, esiste costantemente il rischio che i pattern di bit vengano alterati. Sporcizia o grasso sulle superfici magnetiche, malfunzionamenti dei circuiti, interferenze statiche sui canali di trasmissione e persino la radiazione di fondo nelle memorie RAM possono invertire inavvertitamente lo stato di uno o più bit. Per garantire la massima affidabilità del sistema senza richiedere l'intervento dell'utente, l'hardware integra sofisticate tecniche di codifica volte a rilevare e correggere tali anomalie.</w:t>
-      </w:r>
-    </w:p>
-    <w:p>
-      <w:r>
-        <w:t xml:space="preserve">La strategia di rilevamento più semplice si basa sul principio della parità. Aggiungendo un bit supplementare, denominato </w:t>
-      </w:r>
-      <w:r>
-        <w:rPr>
-          <w:b/>
-          <w:bCs/>
-        </w:rPr>
-        <w:t>bit di parità</w:t>
-      </w:r>
-      <w:r>
-        <w:t xml:space="preserve"> (</w:t>
-      </w:r>
-      <w:r>
-        <w:rPr>
-          <w:i/>
-          <w:iCs/>
-        </w:rPr>
-        <w:t>parity bit</w:t>
-      </w:r>
-      <w:r>
-        <w:t>), a ciascun pattern di dati (ad esempio portando i codici ASCII da 8 a 9 bit), si progetta il sistema in modo che ogni sequenza valida rispetti un preciso vincolo numerico:</w:t>
+        <w:t xml:space="preserve"> bit</w:t>
+      </w:r>
+      <w:r>
+        <w:t xml:space="preserve">), a ciascun pattern di dati (ad esempio portando i codici ASCII da 8 a 9 bit), si progetta il sistema in modo che </w:t>
+      </w:r>
+      <w:r>
+        <w:rPr>
+          <w:highlight w:val="yellow"/>
+        </w:rPr>
+        <w:t>ogni sequenza valida rispetti un preciso vincolo numerico</w:t>
+      </w:r>
+      <w:r>
+        <w:t>:</w:t>
       </w:r>
     </w:p>
     <w:p>
@@ -7294,12 +7482,19 @@
         <w:t>Parità Dispari (Odd Parity)</w:t>
       </w:r>
       <w:r>
-        <w:t xml:space="preserve">: il bit di parità viene impostato a 0 o 1 affinché la stringa complessiva contenga sempre un </w:t>
-      </w:r>
-      <w:r>
-        <w:rPr>
-          <w:b/>
-          <w:bCs/>
+        <w:t xml:space="preserve">: il </w:t>
+      </w:r>
+      <w:r>
+        <w:rPr>
+          <w:highlight w:val="yellow"/>
+        </w:rPr>
+        <w:t xml:space="preserve">bit di parità viene impostato a 0 o 1 affinché la stringa complessiva contenga sempre un </w:t>
+      </w:r>
+      <w:r>
+        <w:rPr>
+          <w:b/>
+          <w:bCs/>
+          <w:highlight w:val="yellow"/>
         </w:rPr>
         <w:t>numero dispari di bit 1</w:t>
       </w:r>
@@ -7322,12 +7517,19 @@
         <w:t>Parità Pari (Even Parity)</w:t>
       </w:r>
       <w:r>
-        <w:t xml:space="preserve">: il bit aggiuntivo viene configurato affinché la sequenza finale contenga un </w:t>
-      </w:r>
-      <w:r>
-        <w:rPr>
-          <w:b/>
-          <w:bCs/>
+        <w:t xml:space="preserve">: il bit aggiuntivo viene configurato affinché la sequenza finale contenga </w:t>
+      </w:r>
+      <w:r>
+        <w:rPr>
+          <w:highlight w:val="yellow"/>
+        </w:rPr>
+        <w:t xml:space="preserve">un </w:t>
+      </w:r>
+      <w:r>
+        <w:rPr>
+          <w:b/>
+          <w:bCs/>
+          <w:highlight w:val="yellow"/>
         </w:rPr>
         <w:t>numero pari di bit 1</w:t>
       </w:r>
@@ -7347,49 +7549,91 @@
         <w:t>RAM</w:t>
       </w:r>
       <w:r>
-        <w:t xml:space="preserve"> per sistemi ad alta affidabilità. Sebbene siano concepite per gestire celle da un byte (8 bit), fisicamente queste memorie dispongono di celle a 9 bit. Durante le operazioni di scrittura, il circuito calcola e memorizza il bit di parità; in fase di lettura, la memoria verifica il vincolo di parità sul pattern a 9 bit e, se non riscontra anomalie, rimuove il bit di controllo restituendo al processore i soli 8 bit di dati originali.</w:t>
-      </w:r>
-    </w:p>
-    <w:p>
-      <w:r>
-        <w:t xml:space="preserve">Nonostante l'efficienza, la parità semplice presenta un limite strutturale: essa </w:t>
-      </w:r>
-      <w:r>
-        <w:rPr>
-          <w:b/>
-          <w:bCs/>
+        <w:t xml:space="preserve"> per sistemi ad alta affidabilità. Sebbene siano concepite per gestire celle da un byte (8 bit), fisicamente queste memorie dispongono di celle a 9 bit. Durante le operazioni di scrittura, il circuito calcola e memorizza </w:t>
+      </w:r>
+      <w:r>
+        <w:lastRenderedPageBreak/>
+        <w:t>il bit di parità; in fase di lettura, la memoria verifica il vincolo di parità sul pattern a 9 bit e, se non riscontra anomalie, rimuove il bit di controllo restituendo al processore i soli 8 bit di dati originali.</w:t>
+      </w:r>
+    </w:p>
+    <w:p>
+      <w:r>
+        <w:rPr>
+          <w:highlight w:val="yellow"/>
+        </w:rPr>
+        <w:t>Nonostante l'efficienza, la parità semplice presenta un limite strutturale</w:t>
+      </w:r>
+      <w:r>
+        <w:t xml:space="preserve">: essa </w:t>
+      </w:r>
+      <w:r>
+        <w:rPr>
+          <w:b/>
+          <w:bCs/>
+          <w:highlight w:val="yellow"/>
         </w:rPr>
         <w:t>non è in grado di rilevare un numero pari di errori simultanei</w:t>
       </w:r>
       <w:r>
-        <w:t xml:space="preserve">. Se all'interno della medesima stringa si verificano due o quattro inversioni di bit, il conteggio complessivo della parità rimane inalterato e l'errore sfugge al controllo. Per proteggere sequenze di dati molto lunghe (come i settori dei dischi magnetici), si ricorre quindi a insiemi di bit di controllo associati a bit distribuiti lungo tutto il blocco, noti come </w:t>
-      </w:r>
-      <w:r>
-        <w:rPr>
-          <w:b/>
-          <w:bCs/>
+        <w:t xml:space="preserve">. Se all'interno della medesima </w:t>
+      </w:r>
+      <w:r>
+        <w:rPr>
+          <w:highlight w:val="yellow"/>
+        </w:rPr>
+        <w:t>stringa si verificano due o quattro inversioni di bit</w:t>
+      </w:r>
+      <w:r>
+        <w:t xml:space="preserve">, il conteggio complessivo della parità rimane inalterato e l'errore sfugge al controllo. Per proteggere sequenze di dati molto lunghe (come i settori dei dischi magnetici), </w:t>
+      </w:r>
+      <w:r>
+        <w:rPr>
+          <w:highlight w:val="yellow"/>
+        </w:rPr>
+        <w:t xml:space="preserve">si ricorre quindi a insiemi di bit di controllo associati a bit distribuiti lungo tutto il blocco, noti come </w:t>
+      </w:r>
+      <w:r>
+        <w:rPr>
+          <w:b/>
+          <w:bCs/>
+          <w:highlight w:val="yellow"/>
         </w:rPr>
         <w:t>checkbyte</w:t>
       </w:r>
       <w:r>
+        <w:rPr>
+          <w:highlight w:val="yellow"/>
+        </w:rPr>
         <w:t xml:space="preserve">, </w:t>
       </w:r>
       <w:r>
         <w:rPr>
           <w:b/>
           <w:bCs/>
+          <w:highlight w:val="yellow"/>
         </w:rPr>
         <w:t>checksum</w:t>
       </w:r>
       <w:r>
+        <w:rPr>
+          <w:highlight w:val="yellow"/>
+        </w:rPr>
         <w:t xml:space="preserve"> o </w:t>
       </w:r>
       <w:r>
         <w:rPr>
           <w:b/>
           <w:bCs/>
-        </w:rPr>
-        <w:t>CRC (Cyclic Redundancy Check)</w:t>
+          <w:highlight w:val="yellow"/>
+        </w:rPr>
+        <w:t>CRC</w:t>
+      </w:r>
+      <w:r>
+        <w:rPr>
+          <w:b/>
+          <w:bCs/>
+        </w:rPr>
+        <w:t xml:space="preserve"> (Cyclic Redundancy Check)</w:t>
       </w:r>
       <w:r>
         <w:t>.</w:t>
@@ -7415,12 +7659,31 @@
     </w:p>
     <w:p>
       <w:r>
-        <w:t xml:space="preserve">Mentre il bit di parità si limita a segnalare la presenza di un errore senza indicare quale bit sia stato alterato, i </w:t>
-      </w:r>
-      <w:r>
-        <w:rPr>
-          <w:b/>
-          <w:bCs/>
+        <w:t xml:space="preserve">Mentre il </w:t>
+      </w:r>
+      <w:r>
+        <w:rPr>
+          <w:highlight w:val="yellow"/>
+        </w:rPr>
+        <w:t>bit di parità</w:t>
+      </w:r>
+      <w:r>
+        <w:t xml:space="preserve"> si </w:t>
+      </w:r>
+      <w:r>
+        <w:rPr>
+          <w:highlight w:val="yellow"/>
+        </w:rPr>
+        <w:t>limita a segnalare la presenza di un errore</w:t>
+      </w:r>
+      <w:r>
+        <w:t xml:space="preserve"> senza indicare quale bit sia stato alterato, i </w:t>
+      </w:r>
+      <w:r>
+        <w:rPr>
+          <w:b/>
+          <w:bCs/>
+          <w:highlight w:val="yellow"/>
         </w:rPr>
         <w:t>codici di correzione degli errori</w:t>
       </w:r>
@@ -7435,12 +7698,19 @@
         <w:t>Error-Correcting Codes</w:t>
       </w:r>
       <w:r>
-        <w:t xml:space="preserve">) consentono all'hardware non solo di individuare l'anomalia, ma anche di </w:t>
-      </w:r>
-      <w:r>
-        <w:rPr>
-          <w:b/>
-          <w:bCs/>
+        <w:t xml:space="preserve">) </w:t>
+      </w:r>
+      <w:r>
+        <w:rPr>
+          <w:highlight w:val="yellow"/>
+        </w:rPr>
+        <w:t xml:space="preserve">consentono all'hardware non solo di individuare l'anomalia, ma anche di </w:t>
+      </w:r>
+      <w:r>
+        <w:rPr>
+          <w:b/>
+          <w:bCs/>
+          <w:highlight w:val="yellow"/>
         </w:rPr>
         <w:t>ricostruire automaticamente il dato originale</w:t>
       </w:r>
@@ -7450,7 +7720,40 @@
     </w:p>
     <w:p>
       <w:r>
-        <w:t xml:space="preserve">Il fondamento teorico di questi codici si basa sul concetto di </w:t>
+        <w:t xml:space="preserve">Il </w:t>
+      </w:r>
+      <w:r>
+        <w:rPr>
+          <w:highlight w:val="yellow"/>
+        </w:rPr>
+        <w:t>fondamento teorico</w:t>
+      </w:r>
+      <w:r>
+        <w:t xml:space="preserve"> di questi codici si basa sul concetto di </w:t>
+      </w:r>
+      <w:r>
+        <w:rPr>
+          <w:b/>
+          <w:bCs/>
+          <w:highlight w:val="yellow"/>
+        </w:rPr>
+        <w:t>Distanza di Hammin</w:t>
+      </w:r>
+      <w:r>
+        <w:rPr>
+          <w:b/>
+          <w:bCs/>
+          <w:highlight w:val="yellow"/>
+        </w:rPr>
+        <w:t>g</w:t>
+      </w:r>
+      <w:r>
+        <w:t>:</w:t>
+      </w:r>
+    </w:p>
+    <w:p>
+      <w:r>
+        <w:t xml:space="preserve">La </w:t>
       </w:r>
       <w:r>
         <w:rPr>
@@ -7460,27 +7763,19 @@
         <w:t>Distanza di Hamming</w:t>
       </w:r>
       <w:r>
-        <w:t>, introdotto dal matematico Richard W. Hamming negli anni '40:</w:t>
-      </w:r>
-    </w:p>
-    <w:p>
-      <w:r>
-        <w:t xml:space="preserve">La </w:t>
-      </w:r>
-      <w:r>
-        <w:rPr>
-          <w:b/>
-          <w:bCs/>
-        </w:rPr>
-        <w:t>Distanza di Hamming</w:t>
-      </w:r>
-      <w:r>
-        <w:t xml:space="preserve"> tra due pattern binari della medesima lunghezza è definita come il </w:t>
-      </w:r>
-      <w:r>
-        <w:rPr>
-          <w:b/>
-          <w:bCs/>
+        <w:t xml:space="preserve"> </w:t>
+      </w:r>
+      <w:r>
+        <w:rPr>
+          <w:highlight w:val="yellow"/>
+        </w:rPr>
+        <w:t xml:space="preserve">tra due pattern binari della medesima lunghezza è definita come il </w:t>
+      </w:r>
+      <w:r>
+        <w:rPr>
+          <w:b/>
+          <w:bCs/>
+          <w:highlight w:val="yellow"/>
         </w:rPr>
         <w:t>numero di posizioni in cui i bit delle due stringhe differiscono tra loro</w:t>
       </w:r>
@@ -7490,12 +7785,28 @@
     </w:p>
     <w:p>
       <w:r>
-        <w:t xml:space="preserve">Per costruire un codice correttore, si progetta l'insieme delle parole legali in modo che ogni coppia di stringhe valide sia separata da una </w:t>
-      </w:r>
-      <w:r>
-        <w:rPr>
-          <w:b/>
-          <w:bCs/>
+        <w:t xml:space="preserve">Per </w:t>
+      </w:r>
+      <w:r>
+        <w:rPr>
+          <w:highlight w:val="yellow"/>
+        </w:rPr>
+        <w:t>costruire un codice correttore</w:t>
+      </w:r>
+      <w:r>
+        <w:t xml:space="preserve">, si </w:t>
+      </w:r>
+      <w:r>
+        <w:rPr>
+          <w:highlight w:val="yellow"/>
+        </w:rPr>
+        <w:t xml:space="preserve">progetta l'insieme delle parole legali in modo che ogni coppia di stringhe valide sia separata da una </w:t>
+      </w:r>
+      <w:r>
+        <w:rPr>
+          <w:b/>
+          <w:bCs/>
+          <w:highlight w:val="yellow"/>
         </w:rPr>
         <w:t>distanza di Hamming minima garantita</w:t>
       </w:r>
@@ -7515,26 +7826,39 @@
           <w:b/>
           <w:bCs/>
         </w:rPr>
-        <w:lastRenderedPageBreak/>
         <w:t>Distanza minima pari a 3</w:t>
       </w:r>
       <w:r>
-        <w:t xml:space="preserve">: consente di </w:t>
-      </w:r>
-      <w:r>
-        <w:rPr>
-          <w:b/>
-          <w:bCs/>
+        <w:t xml:space="preserve">: </w:t>
+      </w:r>
+      <w:r>
+        <w:rPr>
+          <w:highlight w:val="yellow"/>
+        </w:rPr>
+        <w:t xml:space="preserve">consente di </w:t>
+      </w:r>
+      <w:r>
+        <w:rPr>
+          <w:b/>
+          <w:bCs/>
+          <w:highlight w:val="yellow"/>
         </w:rPr>
         <w:t>rilevare fino a 2 bit errati</w:t>
       </w:r>
       <w:r>
-        <w:t xml:space="preserve"> per sequenza e di </w:t>
-      </w:r>
-      <w:r>
-        <w:rPr>
-          <w:b/>
-          <w:bCs/>
+        <w:t xml:space="preserve"> per sequenza </w:t>
+      </w:r>
+      <w:r>
+        <w:rPr>
+          <w:highlight w:val="yellow"/>
+        </w:rPr>
+        <w:t xml:space="preserve">e di </w:t>
+      </w:r>
+      <w:r>
+        <w:rPr>
+          <w:b/>
+          <w:bCs/>
+          <w:highlight w:val="yellow"/>
         </w:rPr>
         <w:t>correggere 1 bit errato</w:t>
       </w:r>
@@ -7557,12 +7881,36 @@
         <w:t>Distanza minima pari a 5</w:t>
       </w:r>
       <w:r>
-        <w:t>: permette di rilevare fino a 4 bit errati simultanei e di correggerne fino a 2 in modo del tutto automatico.</w:t>
-      </w:r>
-    </w:p>
-    <w:p>
-      <w:r>
-        <w:t>L'implementazione dei codici correttori è cruciale nei supporti ad alta densità come gli Hard Disk e nei dischi ottici, nei quali segna una distinzione fondamentale tra i diversi formati:</w:t>
+        <w:t xml:space="preserve">: </w:t>
+      </w:r>
+      <w:r>
+        <w:rPr>
+          <w:highlight w:val="yellow"/>
+        </w:rPr>
+        <w:t>permette di rilevare fino a 4 bit errati simultanei e di correggerne fino a 2</w:t>
+      </w:r>
+      <w:r>
+        <w:t xml:space="preserve"> in modo del tutto automatico.</w:t>
+      </w:r>
+    </w:p>
+    <w:p>
+      <w:r>
+        <w:rPr>
+          <w:highlight w:val="yellow"/>
+        </w:rPr>
+        <w:t>L'implementazione dei codici correttori è cruciale nei supporti ad alta densità come gli Hard Disk</w:t>
+      </w:r>
+      <w:r>
+        <w:t xml:space="preserve"> e nei </w:t>
+      </w:r>
+      <w:r>
+        <w:rPr>
+          <w:highlight w:val="yellow"/>
+        </w:rPr>
+        <w:t>dischi ottici</w:t>
+      </w:r>
+      <w:r>
+        <w:t>, nei quali segna una distinzione fondamentale tra i diversi formati:</w:t>
       </w:r>
     </w:p>
     <w:p>
@@ -7580,7 +7928,16 @@
         <w:t>CD-DA (Compact Disc Digital Audio)</w:t>
       </w:r>
       <w:r>
-        <w:t>: integra una protezione d'errore di base che riduce il tasso di errore residuo a circa 1 disco difettoso ogni 2 CD. Questo livello è accettabile per la riproduzione audio, dove i piccoli difetti vengono facilmente mascherati o interpolati senza un fastidio acustico percepibile.</w:t>
+        <w:t xml:space="preserve">: </w:t>
+      </w:r>
+      <w:r>
+        <w:rPr>
+          <w:highlight w:val="yellow"/>
+        </w:rPr>
+        <w:t>integra una protezione d'errore di base che riduce il tasso di errore residuo a circa 1 disco difettoso ogni 2 CD</w:t>
+      </w:r>
+      <w:r>
+        <w:t>. Questo livello è accettabile per la riproduzione audio, dove i piccoli difetti vengono facilmente mascherati o interpolati senza un fastidio acustico percepibile.</w:t>
       </w:r>
     </w:p>
     <w:p>
@@ -7598,7 +7955,34 @@
         <w:t>CD-ROM (Data Storage)</w:t>
       </w:r>
       <w:r>
-        <w:t xml:space="preserve">: per la distribuzione di software ed eseguibili, dove anche un singolo bit errato renderebbe il programma inutilizzabile, lo standard CD-ROM aggiunge ulteriori livelli di correzione d'errore basati sulla distanza di Hamming, riducendo la probabilità di errore residuo a </w:t>
+        <w:t xml:space="preserve">: </w:t>
+      </w:r>
+      <w:r>
+        <w:rPr>
+          <w:highlight w:val="yellow"/>
+        </w:rPr>
+        <w:t>per la distribuzione di software ed eseguibili</w:t>
+      </w:r>
+      <w:r>
+        <w:t xml:space="preserve">, dove </w:t>
+      </w:r>
+      <w:r>
+        <w:rPr>
+          <w:highlight w:val="yellow"/>
+        </w:rPr>
+        <w:t>anche un singolo bit errato renderebbe il programma inutilizzabile</w:t>
+      </w:r>
+      <w:r>
+        <w:t xml:space="preserve">, lo standard CD-ROM </w:t>
+      </w:r>
+      <w:r>
+        <w:rPr>
+          <w:highlight w:val="yellow"/>
+        </w:rPr>
+        <w:t>aggiunge ulteriori livelli di correzione d'errore basati sulla distanza di Hamming</w:t>
+      </w:r>
+      <w:r>
+        <w:t xml:space="preserve">, riducendo la probabilità di errore residuo a </w:t>
       </w:r>
       <w:r>
         <w:rPr>

</xml_diff>